<commit_message>
Regenerate all resume variants with AI Research Agent project
Masters updated via direct docx XML editing (Word COM hangs after
programmatic rewrites of these documents), then all 14 regional
variants regenerated through generate-resumes.ps1.

Co-Authored-By: Claude Fable 5 <noreply@anthropic.com>
</commit_message>
<xml_diff>
--- a/public/resume/Sridhar_Mahalingam_Software_Developer_Australia.docx
+++ b/public/resume/Sridhar_Mahalingam_Software_Developer_Australia.docx
@@ -8,6 +8,7 @@
         <w:jc w:val="center"/>
       </w:pPr>
       <w:bookmarkStart w:id="0" w:name="_GoBack"/>
+      <w:bookmarkEnd w:id="0"/>
       <w:r>
         <w:rPr>
           <w:b/>
@@ -207,7 +208,13 @@
         <w:rPr>
           <w:color w:val="1A1A1A"/>
         </w:rPr>
-        <w:t>nguage requirements gathering with international stakeholders. Also leads in-house machine learning development, training OCR and computer-vision models internally without third-party AI services. Seeking a Software Developer role in Australia or New Zealand</w:t>
+        <w:t>nguage requirements gathering with international stakeholders. Also leads in-house machine learning development, training OCR and computer-vision models internally without third-party AI services, and building multi-agent LLM research systems on fully loca</w:t>
+      </w:r>
+      <w:r>
+        <w:rPr>
+          <w:color w:val="1A1A1A"/>
+        </w:rPr>
+        <w:t>l models. Seeking a Software Developer role in Australia or New Zealand</w:t>
       </w:r>
       <w:r>
         <w:rPr>
@@ -232,8 +239,288 @@
           <w:sz w:val="20"/>
           <w:szCs w:val="20"/>
         </w:rPr>
-        <w:t>TECHNICAL S</w:t>
-      </w:r>
+        <w:t>TECHNICAL SKILLS</w:t>
+      </w:r>
+    </w:p>
+    <w:p>
+      <w:pPr>
+        <w:spacing w:after="50" w:line="250" w:lineRule="auto"/>
+      </w:pPr>
+      <w:r>
+        <w:rPr>
+          <w:b/>
+          <w:bCs/>
+          <w:color w:val="10314F"/>
+        </w:rPr>
+        <w:t xml:space="preserve">Languages  </w:t>
+      </w:r>
+      <w:r>
+        <w:rPr>
+          <w:color w:val="1A1A1A"/>
+        </w:rPr>
+        <w:t>Python, TypeScript, JavaScript (ES6+), Dart, Kotlin, C#, Rust (Tauri), SQL, HTML5, CSS3</w:t>
+      </w:r>
+    </w:p>
+    <w:p>
+      <w:pPr>
+        <w:spacing w:after="50" w:line="250" w:lineRule="auto"/>
+      </w:pPr>
+      <w:r>
+        <w:rPr>
+          <w:b/>
+          <w:bCs/>
+          <w:color w:val="10314F"/>
+        </w:rPr>
+        <w:t xml:space="preserve">Backend  </w:t>
+      </w:r>
+      <w:r>
+        <w:rPr>
+          <w:color w:val="1A1A1A"/>
+        </w:rPr>
+        <w:t>Django, Django REST Framework, Django Channels, Celery, Flask, RESTful AP</w:t>
+      </w:r>
+      <w:r>
+        <w:rPr>
+          <w:color w:val="1A1A1A"/>
+        </w:rPr>
+        <w:t>I design, JWT &amp; OAuth, WebSockets, Role-Based Access Control, Redis queues</w:t>
+      </w:r>
+    </w:p>
+    <w:p>
+      <w:pPr>
+        <w:spacing w:after="50" w:line="250" w:lineRule="auto"/>
+      </w:pPr>
+      <w:r>
+        <w:rPr>
+          <w:b/>
+          <w:bCs/>
+          <w:color w:val="10314F"/>
+        </w:rPr>
+        <w:t xml:space="preserve">Frontend  </w:t>
+      </w:r>
+      <w:r>
+        <w:rPr>
+          <w:color w:val="1A1A1A"/>
+        </w:rPr>
+        <w:t>React.js, Next.js 14 (App Router, SSR/ISR), React Router, Tailwind CSS, Redux, responsive &amp; mobile-first UI, Core Web Vitals optimisation</w:t>
+      </w:r>
+    </w:p>
+    <w:p>
+      <w:pPr>
+        <w:spacing w:after="50" w:line="250" w:lineRule="auto"/>
+      </w:pPr>
+      <w:r>
+        <w:rPr>
+          <w:b/>
+          <w:bCs/>
+          <w:color w:val="10314F"/>
+        </w:rPr>
+        <w:t xml:space="preserve">Mobile  </w:t>
+      </w:r>
+      <w:r>
+        <w:rPr>
+          <w:color w:val="1A1A1A"/>
+        </w:rPr>
+        <w:t>Flutter (Riverpod, Freeze</w:t>
+      </w:r>
+      <w:r>
+        <w:rPr>
+          <w:color w:val="1A1A1A"/>
+        </w:rPr>
+        <w:t>d, Dio, GoRouter, Hive), React Native, Native Android (Kotlin, Jetpack Compose, Hilt, Room, WorkManager, VpnService)</w:t>
+      </w:r>
+    </w:p>
+    <w:p>
+      <w:pPr>
+        <w:spacing w:after="50" w:line="250" w:lineRule="auto"/>
+      </w:pPr>
+      <w:r>
+        <w:rPr>
+          <w:b/>
+          <w:bCs/>
+          <w:color w:val="10314F"/>
+        </w:rPr>
+        <w:t xml:space="preserve">Architecture  </w:t>
+      </w:r>
+      <w:r>
+        <w:rPr>
+          <w:color w:val="1A1A1A"/>
+        </w:rPr>
+        <w:t>Clean Architecture, ports and adapters, modular monolith, metadata-driven design, event sourcing, multi-tenancy with row-leve</w:t>
+      </w:r>
+      <w:r>
+        <w:rPr>
+          <w:color w:val="1A1A1A"/>
+        </w:rPr>
+        <w:t>l security and query-layer isolation, business rules engines, double-entry ledger design, offline-first systems.</w:t>
+      </w:r>
+    </w:p>
+    <w:p>
+      <w:pPr>
+        <w:spacing w:after="50" w:line="250" w:lineRule="auto"/>
+      </w:pPr>
+      <w:r>
+        <w:rPr>
+          <w:b/>
+          <w:bCs/>
+          <w:color w:val="10314F"/>
+        </w:rPr>
+        <w:t xml:space="preserve">Machine Learning  </w:t>
+      </w:r>
+      <w:r>
+        <w:rPr>
+          <w:color w:val="1A1A1A"/>
+        </w:rPr>
+        <w:t xml:space="preserve">PyTorch, LangGraph multi-agent orchestration, RAG (pgvector, FAISS, hybrid BM25 retrieval), Ollama local LLM inference, FCOS </w:t>
+      </w:r>
+      <w:r>
+        <w:rPr>
+          <w:color w:val="1A1A1A"/>
+        </w:rPr>
+        <w:t>object detection, ONNX Runtime, computer vision, model training and evaluation (IoU precision/recall, mAP), dataset preparation, OCR development, Tesseract, self-hosted GPU inference — built without third-party AI services or external inference APIs.</w:t>
+      </w:r>
+    </w:p>
+    <w:p>
+      <w:pPr>
+        <w:spacing w:after="50" w:line="250" w:lineRule="auto"/>
+      </w:pPr>
+      <w:r>
+        <w:rPr>
+          <w:b/>
+          <w:bCs/>
+          <w:color w:val="10314F"/>
+        </w:rPr>
+        <w:t>Deskt</w:t>
+      </w:r>
+      <w:r>
+        <w:rPr>
+          <w:b/>
+          <w:bCs/>
+          <w:color w:val="10314F"/>
+        </w:rPr>
+        <w:t xml:space="preserve">op  </w:t>
+      </w:r>
+      <w:r>
+        <w:rPr>
+          <w:color w:val="1A1A1A"/>
+        </w:rPr>
+        <w:t>Tauri (Rust shell + web frontend), C# / .NET 10 with WPF, offline-first architecture, on-device persistence, peer synchronisation, Windows packaging.</w:t>
+      </w:r>
+    </w:p>
+    <w:p>
+      <w:pPr>
+        <w:spacing w:after="50" w:line="250" w:lineRule="auto"/>
+      </w:pPr>
+      <w:r>
+        <w:rPr>
+          <w:b/>
+          <w:bCs/>
+          <w:color w:val="10314F"/>
+        </w:rPr>
+        <w:t xml:space="preserve">Databases  </w:t>
+      </w:r>
+      <w:r>
+        <w:rPr>
+          <w:color w:val="1A1A1A"/>
+        </w:rPr>
+        <w:t>PostgreSQL, MySQL, Redis, SQLite — schema design, indexing, query optimisation, migrations</w:t>
+      </w:r>
+    </w:p>
+    <w:p>
+      <w:pPr>
+        <w:spacing w:after="50" w:line="250" w:lineRule="auto"/>
+      </w:pPr>
+      <w:r>
+        <w:rPr>
+          <w:b/>
+          <w:bCs/>
+          <w:color w:val="10314F"/>
+        </w:rPr>
+        <w:t xml:space="preserve">Cloud &amp; DevOps  </w:t>
+      </w:r>
+      <w:r>
+        <w:rPr>
+          <w:color w:val="1A1A1A"/>
+        </w:rPr>
+        <w:t>AWS (S3, SES), Docker, Nginx, Ubuntu Linux (VPS administration), Vercel, Render, Contabo, HTTPS/TLS configuration, Git &amp; GitHub</w:t>
+      </w:r>
+    </w:p>
+    <w:p>
+      <w:pPr>
+        <w:spacing w:after="50" w:line="250" w:lineRule="auto"/>
+      </w:pPr>
+      <w:r>
+        <w:rPr>
+          <w:b/>
+          <w:bCs/>
+          <w:color w:val="10314F"/>
+        </w:rPr>
+        <w:t xml:space="preserve">Integrations  </w:t>
+      </w:r>
+      <w:r>
+        <w:rPr>
+          <w:color w:val="1A1A1A"/>
+        </w:rPr>
+        <w:t xml:space="preserve">Stripe Payment Gateway, Firebase Cloud Messaging, Google Maps Platform, AWS SES, third-party REST </w:t>
+      </w:r>
+      <w:r>
+        <w:rPr>
+          <w:color w:val="1A1A1A"/>
+        </w:rPr>
+        <w:t>APIs</w:t>
+      </w:r>
+    </w:p>
+    <w:p>
+      <w:pPr>
+        <w:spacing w:after="50" w:line="250" w:lineRule="auto"/>
+      </w:pPr>
+      <w:r>
+        <w:rPr>
+          <w:b/>
+          <w:bCs/>
+          <w:color w:val="10314F"/>
+        </w:rPr>
+        <w:t xml:space="preserve">Systems &amp; Networking  </w:t>
+      </w:r>
+      <w:r>
+        <w:rPr>
+          <w:color w:val="1A1A1A"/>
+        </w:rPr>
+        <w:t>DNS protocol and resolution, DoH/DoT, Android VpnService and TUN packet processing, local DNS server implementation, Bloom filters, Patricia tries, LFU caching, Manifest V3 browser extensions.</w:t>
+      </w:r>
+    </w:p>
+    <w:p>
+      <w:pPr>
+        <w:spacing w:after="50" w:line="250" w:lineRule="auto"/>
+      </w:pPr>
+      <w:r>
+        <w:rPr>
+          <w:b/>
+          <w:bCs/>
+          <w:color w:val="10314F"/>
+        </w:rPr>
+        <w:t xml:space="preserve">Practices  </w:t>
+      </w:r>
+      <w:r>
+        <w:rPr>
+          <w:color w:val="1A1A1A"/>
+        </w:rPr>
+        <w:t>Agile delivery, code revi</w:t>
+      </w:r>
+      <w:r>
+        <w:rPr>
+          <w:color w:val="1A1A1A"/>
+        </w:rPr>
+        <w:t>ew, Postman API testing, unit testing (JUnit, MockK), performance profiling, technical SEO, security hardening</w:t>
+      </w:r>
+    </w:p>
+    <w:p>
+      <w:pPr>
+        <w:pBdr>
+          <w:bottom w:val="single" w:sz="8" w:space="3" w:color="10314F"/>
+        </w:pBdr>
+        <w:spacing w:before="220" w:after="100"/>
+      </w:pPr>
       <w:r>
         <w:rPr>
           <w:b/>
@@ -243,295 +530,6 @@
           <w:sz w:val="20"/>
           <w:szCs w:val="20"/>
         </w:rPr>
-        <w:t>KILLS</w:t>
-      </w:r>
-    </w:p>
-    <w:p>
-      <w:pPr>
-        <w:spacing w:after="50" w:line="250" w:lineRule="auto"/>
-      </w:pPr>
-      <w:r>
-        <w:rPr>
-          <w:b/>
-          <w:bCs/>
-          <w:color w:val="10314F"/>
-        </w:rPr>
-        <w:t xml:space="preserve">Languages  </w:t>
-      </w:r>
-      <w:r>
-        <w:rPr>
-          <w:color w:val="1A1A1A"/>
-        </w:rPr>
-        <w:t>Python, TypeScript, JavaScript (ES6+), Dart, Kotlin, C#, Rust (Tauri), SQL, HTML5, CSS3</w:t>
-      </w:r>
-    </w:p>
-    <w:p>
-      <w:pPr>
-        <w:spacing w:after="50" w:line="250" w:lineRule="auto"/>
-      </w:pPr>
-      <w:r>
-        <w:rPr>
-          <w:b/>
-          <w:bCs/>
-          <w:color w:val="10314F"/>
-        </w:rPr>
-        <w:t xml:space="preserve">Backend  </w:t>
-      </w:r>
-      <w:r>
-        <w:rPr>
-          <w:color w:val="1A1A1A"/>
-        </w:rPr>
-        <w:t>Django, Django REST Framework, Django Channels, Celery, Flask, RESTful API design, JWT &amp; OAuth, WebSockets, Role-Based Access Control, Redis q</w:t>
-      </w:r>
-      <w:r>
-        <w:rPr>
-          <w:color w:val="1A1A1A"/>
-        </w:rPr>
-        <w:t>ueues</w:t>
-      </w:r>
-    </w:p>
-    <w:p>
-      <w:pPr>
-        <w:spacing w:after="50" w:line="250" w:lineRule="auto"/>
-      </w:pPr>
-      <w:r>
-        <w:rPr>
-          <w:b/>
-          <w:bCs/>
-          <w:color w:val="10314F"/>
-        </w:rPr>
-        <w:t xml:space="preserve">Frontend  </w:t>
-      </w:r>
-      <w:r>
-        <w:rPr>
-          <w:color w:val="1A1A1A"/>
-        </w:rPr>
-        <w:t>React.js, Next.js 14 (App Router, SSR/ISR), React Router, Tailwind CSS, Redux, responsive &amp; mobile-first UI, Core Web Vitals optimisation</w:t>
-      </w:r>
-    </w:p>
-    <w:p>
-      <w:pPr>
-        <w:spacing w:after="50" w:line="250" w:lineRule="auto"/>
-      </w:pPr>
-      <w:r>
-        <w:rPr>
-          <w:b/>
-          <w:bCs/>
-          <w:color w:val="10314F"/>
-        </w:rPr>
-        <w:t xml:space="preserve">Mobile  </w:t>
-      </w:r>
-      <w:r>
-        <w:rPr>
-          <w:color w:val="1A1A1A"/>
-        </w:rPr>
-        <w:t>Flutter (Riverpod, Freezed, Dio, GoRouter, Hive), React Native, Native Android (Kotlin, Jetpac</w:t>
-      </w:r>
-      <w:r>
-        <w:rPr>
-          <w:color w:val="1A1A1A"/>
-        </w:rPr>
-        <w:t>k Compose, Hilt, Room, WorkManager, VpnService)</w:t>
-      </w:r>
-    </w:p>
-    <w:p>
-      <w:pPr>
-        <w:spacing w:after="50" w:line="250" w:lineRule="auto"/>
-      </w:pPr>
-      <w:r>
-        <w:rPr>
-          <w:b/>
-          <w:bCs/>
-          <w:color w:val="10314F"/>
-        </w:rPr>
-        <w:t xml:space="preserve">Architecture  </w:t>
-      </w:r>
-      <w:r>
-        <w:rPr>
-          <w:color w:val="1A1A1A"/>
-        </w:rPr>
-        <w:t>Clean Architecture, ports and adapters, modular monolith, metadata-driven design, event sourcing, multi-tenancy with row-level security and query-layer isolation, business rules engines, double-</w:t>
-      </w:r>
-      <w:r>
-        <w:rPr>
-          <w:color w:val="1A1A1A"/>
-        </w:rPr>
-        <w:t>entry ledger design, offline-first systems.</w:t>
-      </w:r>
-    </w:p>
-    <w:p>
-      <w:pPr>
-        <w:spacing w:after="50" w:line="250" w:lineRule="auto"/>
-      </w:pPr>
-      <w:r>
-        <w:rPr>
-          <w:b/>
-          <w:bCs/>
-          <w:color w:val="10314F"/>
-        </w:rPr>
-        <w:t xml:space="preserve">Machine Learning  </w:t>
-      </w:r>
-      <w:r>
-        <w:rPr>
-          <w:color w:val="1A1A1A"/>
-        </w:rPr>
-        <w:t>PyTorch, FCOS object detection, ONNX Runtime, computer vision, model training and evaluation (IoU precision/recall, mAP), dataset preparation, OCR development, Tesseract, self-hosted GPU inferen</w:t>
-      </w:r>
-      <w:r>
-        <w:rPr>
-          <w:color w:val="1A1A1A"/>
-        </w:rPr>
-        <w:t>ce — built without third-party AI services or external inference APIs.</w:t>
-      </w:r>
-    </w:p>
-    <w:p>
-      <w:pPr>
-        <w:spacing w:after="50" w:line="250" w:lineRule="auto"/>
-      </w:pPr>
-      <w:r>
-        <w:rPr>
-          <w:b/>
-          <w:bCs/>
-          <w:color w:val="10314F"/>
-        </w:rPr>
-        <w:t xml:space="preserve">Desktop  </w:t>
-      </w:r>
-      <w:r>
-        <w:rPr>
-          <w:color w:val="1A1A1A"/>
-        </w:rPr>
-        <w:t>Tauri (Rust shell + web frontend), C# / .NET 10 with WPF, offline-first architecture, on-device persistence, peer synchronisation, Windows packaging.</w:t>
-      </w:r>
-    </w:p>
-    <w:p>
-      <w:pPr>
-        <w:spacing w:after="50" w:line="250" w:lineRule="auto"/>
-      </w:pPr>
-      <w:r>
-        <w:rPr>
-          <w:b/>
-          <w:bCs/>
-          <w:color w:val="10314F"/>
-        </w:rPr>
-        <w:t xml:space="preserve">Databases  </w:t>
-      </w:r>
-      <w:r>
-        <w:rPr>
-          <w:color w:val="1A1A1A"/>
-        </w:rPr>
-        <w:t>PostgreSQL, MyS</w:t>
-      </w:r>
-      <w:r>
-        <w:rPr>
-          <w:color w:val="1A1A1A"/>
-        </w:rPr>
-        <w:t>QL, Redis, SQLite — schema design, indexing, query optimisation, migrations</w:t>
-      </w:r>
-    </w:p>
-    <w:p>
-      <w:pPr>
-        <w:spacing w:after="50" w:line="250" w:lineRule="auto"/>
-      </w:pPr>
-      <w:r>
-        <w:rPr>
-          <w:b/>
-          <w:bCs/>
-          <w:color w:val="10314F"/>
-        </w:rPr>
-        <w:t xml:space="preserve">Cloud &amp; DevOps  </w:t>
-      </w:r>
-      <w:r>
-        <w:rPr>
-          <w:color w:val="1A1A1A"/>
-        </w:rPr>
-        <w:t>AWS (S3, SES), Docker, Nginx, Ubuntu Linux (VPS administration), Vercel, Render, Contabo, HTTPS/TLS configuration, Git &amp; GitHub</w:t>
-      </w:r>
-    </w:p>
-    <w:p>
-      <w:pPr>
-        <w:spacing w:after="50" w:line="250" w:lineRule="auto"/>
-      </w:pPr>
-      <w:r>
-        <w:rPr>
-          <w:b/>
-          <w:bCs/>
-          <w:color w:val="10314F"/>
-        </w:rPr>
-        <w:t xml:space="preserve">Integrations  </w:t>
-      </w:r>
-      <w:r>
-        <w:rPr>
-          <w:color w:val="1A1A1A"/>
-        </w:rPr>
-        <w:t>Stripe Payment Gateway</w:t>
-      </w:r>
-      <w:r>
-        <w:rPr>
-          <w:color w:val="1A1A1A"/>
-        </w:rPr>
-        <w:t>, Firebase Cloud Messaging, Google Maps Platform, AWS SES, third-party REST APIs</w:t>
-      </w:r>
-    </w:p>
-    <w:p>
-      <w:pPr>
-        <w:spacing w:after="50" w:line="250" w:lineRule="auto"/>
-      </w:pPr>
-      <w:r>
-        <w:rPr>
-          <w:b/>
-          <w:bCs/>
-          <w:color w:val="10314F"/>
-        </w:rPr>
-        <w:t xml:space="preserve">Systems &amp; Networking  </w:t>
-      </w:r>
-      <w:r>
-        <w:rPr>
-          <w:color w:val="1A1A1A"/>
-        </w:rPr>
-        <w:t>DNS protocol and resolution, DoH/DoT, Android VpnService and TUN packet processing, local DNS server implementation, Bloom filters, Patricia tries, LFU c</w:t>
-      </w:r>
-      <w:r>
-        <w:rPr>
-          <w:color w:val="1A1A1A"/>
-        </w:rPr>
-        <w:t>aching, Manifest V3 browser extensions.</w:t>
-      </w:r>
-    </w:p>
-    <w:p>
-      <w:pPr>
-        <w:spacing w:after="50" w:line="250" w:lineRule="auto"/>
-      </w:pPr>
-      <w:r>
-        <w:rPr>
-          <w:b/>
-          <w:bCs/>
-          <w:color w:val="10314F"/>
-        </w:rPr>
-        <w:t xml:space="preserve">Practices  </w:t>
-      </w:r>
-      <w:r>
-        <w:rPr>
-          <w:color w:val="1A1A1A"/>
-        </w:rPr>
-        <w:t>Agile delivery, code review, Postman API testing, unit testing (JUnit, MockK), performance profiling, technical SEO, security hardening</w:t>
-      </w:r>
-    </w:p>
-    <w:p>
-      <w:pPr>
-        <w:pBdr>
-          <w:bottom w:val="single" w:sz="8" w:space="3" w:color="10314F"/>
-        </w:pBdr>
-        <w:spacing w:before="220" w:after="100"/>
-      </w:pPr>
-      <w:r>
-        <w:rPr>
-          <w:b/>
-          <w:bCs/>
-          <w:color w:val="10314F"/>
-          <w:spacing w:val="24"/>
-          <w:sz w:val="20"/>
-          <w:szCs w:val="20"/>
-        </w:rPr>
         <w:t>PROFESSIONAL EXPERIENCE</w:t>
       </w:r>
     </w:p>
@@ -563,15 +561,7 @@
           <w:sz w:val="20"/>
           <w:szCs w:val="20"/>
         </w:rPr>
-        <w:t>Holora Performan</w:t>
-      </w:r>
-      <w:r>
-        <w:rPr>
-          <w:color w:val="1A1A1A"/>
-          <w:sz w:val="20"/>
-          <w:szCs w:val="20"/>
-        </w:rPr>
-        <w:t>ce, Doha, Qatar</w:t>
+        <w:t>Holora Performance, Doha, Qatar</w:t>
       </w:r>
       <w:r>
         <w:rPr>
@@ -1954,7 +1944,15 @@
           <w:bCs/>
           <w:color w:val="10314F"/>
         </w:rPr>
-        <w:t>TrafficVision — AI Traffic Intelligence Platform</w:t>
+        <w:t>AI Research Agent — Multi-Agent Research System with Verifie</w:t>
+      </w:r>
+      <w:r>
+        <w:rPr>
+          <w:b/>
+          <w:bCs/>
+          <w:color w:val="10314F"/>
+        </w:rPr>
+        <w:t>d Citations</w:t>
       </w:r>
       <w:r>
         <w:rPr>
@@ -1964,7 +1962,113 @@
           <w:sz w:val="18"/>
           <w:szCs w:val="18"/>
         </w:rPr>
-        <w:t xml:space="preserve">  ·  Indepen</w:t>
+        <w:t xml:space="preserve">  ·  Independent project · sole architect &amp; developer</w:t>
+      </w:r>
+    </w:p>
+    <w:p>
+      <w:pPr>
+        <w:spacing w:after="50" w:line="250" w:lineRule="auto"/>
+      </w:pPr>
+      <w:r>
+        <w:rPr>
+          <w:b/>
+          <w:bCs/>
+          <w:color w:val="1B6E8C"/>
+          <w:sz w:val="17"/>
+          <w:szCs w:val="17"/>
+        </w:rPr>
+        <w:t>Stack: Python · LangGraph · FastAPI · Ollama (local LLM) · PostgreSQL + pgvector · FAISS · sentence-transformers · Next.js 16 · TypeScript</w:t>
+      </w:r>
+    </w:p>
+    <w:p>
+      <w:pPr>
+        <w:pStyle w:val="ListParagraph"/>
+        <w:numPr>
+          <w:ilvl w:val="0"/>
+          <w:numId w:val="2"/>
+        </w:numPr>
+        <w:spacing w:after="40" w:line="250" w:lineRule="auto"/>
+      </w:pPr>
+      <w:r>
+        <w:rPr>
+          <w:color w:val="1A1A1A"/>
+        </w:rPr>
+        <w:t>Built a multi-agent research system on a LangGraph s</w:t>
+      </w:r>
+      <w:r>
+        <w:rPr>
+          <w:color w:val="1A1A1A"/>
+        </w:rPr>
+        <w:t xml:space="preserve">tate machine — Planner, Researcher, Analyst, Critic, Writer and Citation-Verifier agents that search the real web, build a per-session RAG index with full provenance, and generate findings grounded only in retrieved evidence — all running on a fully local </w:t>
+      </w:r>
+      <w:r>
+        <w:rPr>
+          <w:color w:val="1A1A1A"/>
+        </w:rPr>
+        <w:t>LLM (Ollama) with local embeddings and no cloud AI.</w:t>
+      </w:r>
+    </w:p>
+    <w:p>
+      <w:pPr>
+        <w:pStyle w:val="ListParagraph"/>
+        <w:numPr>
+          <w:ilvl w:val="0"/>
+          <w:numId w:val="2"/>
+        </w:numPr>
+        <w:spacing w:after="40" w:line="250" w:lineRule="auto"/>
+      </w:pPr>
+      <w:r>
+        <w:rPr>
+          <w:color w:val="1A1A1A"/>
+        </w:rPr>
+        <w:t>Engineered hallucination reduction as architecture rather than prompting — findings citing pages never fetched are discarded deterministically, a Critic gate loops the workflow back to research when evide</w:t>
+      </w:r>
+      <w:r>
+        <w:rPr>
+          <w:color w:val="1A1A1A"/>
+        </w:rPr>
+        <w:t>nce is insufficient (hard-capped at two iterations), and every citation in the final report is semantically verified against the session's own sources; measured citation coverage rose from 0% to 60–86%.</w:t>
+      </w:r>
+    </w:p>
+    <w:p>
+      <w:pPr>
+        <w:pStyle w:val="ListParagraph"/>
+        <w:numPr>
+          <w:ilvl w:val="0"/>
+          <w:numId w:val="2"/>
+        </w:numPr>
+        <w:spacing w:after="40" w:line="250" w:lineRule="auto"/>
+      </w:pPr>
+      <w:r>
+        <w:rPr>
+          <w:color w:val="1A1A1A"/>
+        </w:rPr>
+        <w:t>Delivered a FastAPI + Next.js research workstation st</w:t>
+      </w:r>
+      <w:r>
+        <w:rPr>
+          <w:color w:val="1A1A1A"/>
+        </w:rPr>
+        <w:t>reaming live agent progress over Server-Sent Events, with hybrid retrieval (dense embeddings fused with BM25 via reciprocal rank fusion), schema-constrained JSON decoding, provider-fallback web search and a built-in evaluation harness benchmarking citation</w:t>
+      </w:r>
+      <w:r>
+        <w:rPr>
+          <w:color w:val="1A1A1A"/>
+        </w:rPr>
+        <w:t xml:space="preserve"> coverage, groundedness and latency across local models — 38 tests, all external services mocked.</w:t>
+      </w:r>
+    </w:p>
+    <w:p>
+      <w:pPr>
+        <w:spacing w:before="120" w:after="30"/>
+      </w:pPr>
+      <w:r>
+        <w:rPr>
+          <w:b/>
+          <w:bCs/>
+          <w:color w:val="10314F"/>
+        </w:rPr>
+        <w:t>TrafficVision — AI Traffic Intelligence Platform</w:t>
       </w:r>
       <w:r>
         <w:rPr>
@@ -1974,7 +2078,7 @@
           <w:sz w:val="18"/>
           <w:szCs w:val="18"/>
         </w:rPr>
-        <w:t>dent research · sole architect &amp; developer · model in training</w:t>
+        <w:t xml:space="preserve">  ·  Independent research · sole architect &amp; developer · model in training</w:t>
       </w:r>
     </w:p>
     <w:p>
@@ -1997,79 +2101,81 @@
           <w:sz w:val="17"/>
           <w:szCs w:val="17"/>
         </w:rPr>
-        <w:t>Python · PyTorch · FCOS / ONNX Runtime · Django REST Framework · Celery · Redis · PostgreSQL · Next.js</w:t>
-      </w:r>
-    </w:p>
-    <w:p>
-      <w:pPr>
-        <w:pStyle w:val="ListParagraph"/>
-        <w:numPr>
-          <w:ilvl w:val="0"/>
-          <w:numId w:val="2"/>
-        </w:numPr>
-        <w:spacing w:after="40" w:line="250" w:lineRule="auto"/>
-      </w:pPr>
-      <w:r>
-        <w:rPr>
-          <w:color w:val="1A1A1A"/>
-        </w:rPr>
-        <w:t>Built a computer-vision platform that ingests traffic video and turns it into struc</w:t>
-      </w:r>
-      <w:r>
-        <w:rPr>
-          <w:color w:val="1A1A1A"/>
-        </w:rPr>
-        <w:t>tured, real-time intelligence about vehicles and road conditions — modelling the full domain from city down to individual lanes, cameras, regions-of-interest and counting lines, so every detection carries real spatial meaning rather than raw pixel boxes.</w:t>
-      </w:r>
-    </w:p>
-    <w:p>
-      <w:pPr>
-        <w:pStyle w:val="ListParagraph"/>
-        <w:numPr>
-          <w:ilvl w:val="0"/>
-          <w:numId w:val="2"/>
-        </w:numPr>
-        <w:spacing w:after="40" w:line="250" w:lineRule="auto"/>
-      </w:pPr>
-      <w:r>
-        <w:rPr>
-          <w:color w:val="1A1A1A"/>
-        </w:rPr>
-        <w:t>T</w:t>
-      </w:r>
-      <w:r>
-        <w:rPr>
-          <w:color w:val="1A1A1A"/>
-        </w:rPr>
-        <w:t>rained an FCOS vehicle detector exported to ONNX for fast inference, with train-equals-serve preprocessing; owns the full pipeline — dataset preparation, leakage-safe splits, multi-day interruptible training with checkpoint and resume, and honest evaluatio</w:t>
-      </w:r>
-      <w:r>
-        <w:rPr>
-          <w:color w:val="1A1A1A"/>
-        </w:rPr>
-        <w:t>n (IoU precision/recall, mAP) on held-out data.</w:t>
-      </w:r>
-    </w:p>
-    <w:p>
-      <w:pPr>
-        <w:pStyle w:val="ListParagraph"/>
-        <w:numPr>
-          <w:ilvl w:val="0"/>
-          <w:numId w:val="2"/>
-        </w:numPr>
-        <w:spacing w:after="40" w:line="250" w:lineRule="auto"/>
-      </w:pPr>
-      <w:r>
-        <w:rPr>
-          <w:color w:val="1A1A1A"/>
-        </w:rPr>
-        <w:t xml:space="preserve">Engineered GPU-managed processing sessions on Celery that run video through the model off the request path, with GPU allocation, heartbeats and automatic crash recovery, so long-running analysis never blocks </w:t>
-      </w:r>
-      <w:r>
-        <w:rPr>
-          <w:color w:val="1A1A1A"/>
-        </w:rPr>
-        <w:t>the API.</w:t>
+        <w:t>Python · PyTorch · FCOS / ON</w:t>
+      </w:r>
+      <w:r>
+        <w:rPr>
+          <w:color w:val="4A4A4A"/>
+          <w:sz w:val="17"/>
+          <w:szCs w:val="17"/>
+        </w:rPr>
+        <w:t>NX Runtime · Django REST Framework · Celery · Redis · PostgreSQL · Next.js</w:t>
+      </w:r>
+    </w:p>
+    <w:p>
+      <w:pPr>
+        <w:pStyle w:val="ListParagraph"/>
+        <w:numPr>
+          <w:ilvl w:val="0"/>
+          <w:numId w:val="2"/>
+        </w:numPr>
+        <w:spacing w:after="40" w:line="250" w:lineRule="auto"/>
+      </w:pPr>
+      <w:r>
+        <w:rPr>
+          <w:color w:val="1A1A1A"/>
+        </w:rPr>
+        <w:t xml:space="preserve">Built a computer-vision platform that ingests traffic video and turns it into structured, real-time intelligence about vehicles and road conditions — modelling the full domain from </w:t>
+      </w:r>
+      <w:r>
+        <w:rPr>
+          <w:color w:val="1A1A1A"/>
+        </w:rPr>
+        <w:t>city down to individual lanes, cameras, regions-of-interest and counting lines, so every detection carries real spatial meaning rather than raw pixel boxes.</w:t>
+      </w:r>
+    </w:p>
+    <w:p>
+      <w:pPr>
+        <w:pStyle w:val="ListParagraph"/>
+        <w:numPr>
+          <w:ilvl w:val="0"/>
+          <w:numId w:val="2"/>
+        </w:numPr>
+        <w:spacing w:after="40" w:line="250" w:lineRule="auto"/>
+      </w:pPr>
+      <w:r>
+        <w:rPr>
+          <w:color w:val="1A1A1A"/>
+        </w:rPr>
+        <w:t>Trained an FCOS vehicle detector exported to ONNX for fast inference, with train-equals-serve prepr</w:t>
+      </w:r>
+      <w:r>
+        <w:rPr>
+          <w:color w:val="1A1A1A"/>
+        </w:rPr>
+        <w:t>ocessing; owns the full pipeline — dataset preparation, leakage-safe splits, multi-day interruptible training with checkpoint and resume, and honest evaluation (IoU precision/recall, mAP) on held-out data.</w:t>
+      </w:r>
+    </w:p>
+    <w:p>
+      <w:pPr>
+        <w:pStyle w:val="ListParagraph"/>
+        <w:numPr>
+          <w:ilvl w:val="0"/>
+          <w:numId w:val="2"/>
+        </w:numPr>
+        <w:spacing w:after="40" w:line="250" w:lineRule="auto"/>
+      </w:pPr>
+      <w:r>
+        <w:rPr>
+          <w:color w:val="1A1A1A"/>
+        </w:rPr>
+        <w:t>Engineered GPU-managed processing sessions on Cele</w:t>
+      </w:r>
+      <w:r>
+        <w:rPr>
+          <w:color w:val="1A1A1A"/>
+        </w:rPr>
+        <w:t>ry that run video through the model off the request path, with GPU allocation, heartbeats and automatic crash recovery, so long-running analysis never blocks the API.</w:t>
       </w:r>
     </w:p>
     <w:p>
@@ -2092,115 +2198,7 @@
           <w:sz w:val="18"/>
           <w:szCs w:val="18"/>
         </w:rPr>
-        <w:t xml:space="preserve">  ·  Independent project · sole architect &amp; developer</w:t>
-      </w:r>
-    </w:p>
-    <w:p>
-      <w:pPr>
-        <w:spacing w:after="50" w:line="250" w:lineRule="auto"/>
-      </w:pPr>
-      <w:r>
-        <w:rPr>
-          <w:b/>
-          <w:bCs/>
-          <w:color w:val="1B6E8C"/>
-          <w:sz w:val="17"/>
-          <w:szCs w:val="17"/>
-        </w:rPr>
-        <w:t xml:space="preserve">Stack: </w:t>
-      </w:r>
-      <w:r>
-        <w:rPr>
-          <w:color w:val="4A4A4A"/>
-          <w:sz w:val="17"/>
-          <w:szCs w:val="17"/>
-        </w:rPr>
-        <w:t>Python 3.12 · Django 5.2 · DRF · Django Channels · Celery · Redis · PostgreSQL · Next.js 15 · TypeScript · TanStack Query · Docker</w:t>
-      </w:r>
-    </w:p>
-    <w:p>
-      <w:pPr>
-        <w:pStyle w:val="ListParagraph"/>
-        <w:numPr>
-          <w:ilvl w:val="0"/>
-          <w:numId w:val="2"/>
-        </w:numPr>
-        <w:spacing w:after="40" w:line="250" w:lineRule="auto"/>
-      </w:pPr>
-      <w:r>
-        <w:rPr>
-          <w:color w:val="1A1A1A"/>
-        </w:rPr>
-        <w:t>Built a</w:t>
-      </w:r>
-      <w:r>
-        <w:rPr>
-          <w:color w:val="1A1A1A"/>
-        </w:rPr>
-        <w:t xml:space="preserve"> multi-tenant, headless commerce platform whose backend is deliberately vertical-neutral — the same engine powers a boutique, grocery, pharmacy or B2B wholesaler, with each store’s identity expressed as configuration rather than hardcoded logic and no busi</w:t>
-      </w:r>
-      <w:r>
-        <w:rPr>
-          <w:color w:val="1A1A1A"/>
-        </w:rPr>
-        <w:t>ness-type conditional anywhere in the backend.</w:t>
-      </w:r>
-    </w:p>
-    <w:p>
-      <w:pPr>
-        <w:pStyle w:val="ListParagraph"/>
-        <w:numPr>
-          <w:ilvl w:val="0"/>
-          <w:numId w:val="2"/>
-        </w:numPr>
-        <w:spacing w:after="40" w:line="250" w:lineRule="auto"/>
-      </w:pPr>
-      <w:r>
-        <w:rPr>
-          <w:color w:val="1A1A1A"/>
-        </w:rPr>
-        <w:t>Designed the catalogue engine end to end (tenant → catalogue → category → product → variant) with a full variant engine, dynamic attributes, brands, collections and SEO/JSON-LD generation, plus a global-market</w:t>
-      </w:r>
-      <w:r>
-        <w:rPr>
-          <w:color w:val="1A1A1A"/>
-        </w:rPr>
-        <w:t xml:space="preserve"> pricing engine modelling market as distinct from currency with locked prices, FX fallback and a deterministic no-borrowing resolver.</w:t>
-      </w:r>
-    </w:p>
-    <w:p>
-      <w:pPr>
-        <w:pStyle w:val="ListParagraph"/>
-        <w:numPr>
-          <w:ilvl w:val="0"/>
-          <w:numId w:val="2"/>
-        </w:numPr>
-        <w:spacing w:after="40" w:line="250" w:lineRule="auto"/>
-      </w:pPr>
-      <w:r>
-        <w:rPr>
-          <w:color w:val="1A1A1A"/>
-        </w:rPr>
-        <w:t>Applied ports and adapters from day one — payment, email, storage, search and notification each behind an abstract service</w:t>
-      </w:r>
-      <w:r>
-        <w:rPr>
-          <w:color w:val="1A1A1A"/>
-        </w:rPr>
-        <w:t xml:space="preserve"> with swappable adapters resolved per tenant — under Clean Architecture with CI-enforced dependency boundaries, strict mypy typing, UUIDv7 keys and feature flags.</w:t>
-      </w:r>
-    </w:p>
-    <w:p>
-      <w:pPr>
-        <w:spacing w:before="120" w:after="30"/>
-      </w:pPr>
-      <w:r>
-        <w:rPr>
-          <w:b/>
-          <w:bCs/>
-          <w:color w:val="10314F"/>
-        </w:rPr>
-        <w:t>Airsume — Fully-Offline Resume Intelligence &amp; ATS Platform</w:t>
+        <w:t xml:space="preserve">  ·  Independent project · sole architect</w:t>
       </w:r>
       <w:r>
         <w:rPr>
@@ -2210,7 +2208,115 @@
           <w:sz w:val="18"/>
           <w:szCs w:val="18"/>
         </w:rPr>
-        <w:t xml:space="preserve">  ·  Independent research · sole ar</w:t>
+        <w:t xml:space="preserve"> &amp; developer</w:t>
+      </w:r>
+    </w:p>
+    <w:p>
+      <w:pPr>
+        <w:spacing w:after="50" w:line="250" w:lineRule="auto"/>
+      </w:pPr>
+      <w:r>
+        <w:rPr>
+          <w:b/>
+          <w:bCs/>
+          <w:color w:val="1B6E8C"/>
+          <w:sz w:val="17"/>
+          <w:szCs w:val="17"/>
+        </w:rPr>
+        <w:t xml:space="preserve">Stack: </w:t>
+      </w:r>
+      <w:r>
+        <w:rPr>
+          <w:color w:val="4A4A4A"/>
+          <w:sz w:val="17"/>
+          <w:szCs w:val="17"/>
+        </w:rPr>
+        <w:t>Python 3.12 · Django 5.2 · DRF · Django Channels · Celery · Redis · PostgreSQL · Next.js 15 · TypeScript · TanStack Query · Docker</w:t>
+      </w:r>
+    </w:p>
+    <w:p>
+      <w:pPr>
+        <w:pStyle w:val="ListParagraph"/>
+        <w:numPr>
+          <w:ilvl w:val="0"/>
+          <w:numId w:val="2"/>
+        </w:numPr>
+        <w:spacing w:after="40" w:line="250" w:lineRule="auto"/>
+      </w:pPr>
+      <w:r>
+        <w:rPr>
+          <w:color w:val="1A1A1A"/>
+        </w:rPr>
+        <w:t>Built a multi-tenant, headless commerce platform whose backend is deliberately vertical-neutral — the sam</w:t>
+      </w:r>
+      <w:r>
+        <w:rPr>
+          <w:color w:val="1A1A1A"/>
+        </w:rPr>
+        <w:t>e engine powers a boutique, grocery, pharmacy or B2B wholesaler, with each store’s identity expressed as configuration rather than hardcoded logic and no business-type conditional anywhere in the backend.</w:t>
+      </w:r>
+    </w:p>
+    <w:p>
+      <w:pPr>
+        <w:pStyle w:val="ListParagraph"/>
+        <w:numPr>
+          <w:ilvl w:val="0"/>
+          <w:numId w:val="2"/>
+        </w:numPr>
+        <w:spacing w:after="40" w:line="250" w:lineRule="auto"/>
+      </w:pPr>
+      <w:r>
+        <w:rPr>
+          <w:color w:val="1A1A1A"/>
+        </w:rPr>
+        <w:t xml:space="preserve">Designed the catalogue engine end to end (tenant → </w:t>
+      </w:r>
+      <w:r>
+        <w:rPr>
+          <w:color w:val="1A1A1A"/>
+        </w:rPr>
+        <w:t>catalogue → category → product → variant) with a full variant engine, dynamic attributes, brands, collections and SEO/JSON-LD generation, plus a global-market pricing engine modelling market as distinct from currency with locked prices, FX fallback and a d</w:t>
+      </w:r>
+      <w:r>
+        <w:rPr>
+          <w:color w:val="1A1A1A"/>
+        </w:rPr>
+        <w:t>eterministic no-borrowing resolver.</w:t>
+      </w:r>
+    </w:p>
+    <w:p>
+      <w:pPr>
+        <w:pStyle w:val="ListParagraph"/>
+        <w:numPr>
+          <w:ilvl w:val="0"/>
+          <w:numId w:val="2"/>
+        </w:numPr>
+        <w:spacing w:after="40" w:line="250" w:lineRule="auto"/>
+      </w:pPr>
+      <w:r>
+        <w:rPr>
+          <w:color w:val="1A1A1A"/>
+        </w:rPr>
+        <w:t>Applied ports and adapters from day one — payment, email, storage, search and notification each behind an abstract service with swappable adapters resolved per tenant — under Clean Architecture with CI-enforced dependency boundaries, strict mypy typing, UU</w:t>
+      </w:r>
+      <w:r>
+        <w:rPr>
+          <w:color w:val="1A1A1A"/>
+        </w:rPr>
+        <w:t>IDv7 keys and feature flags.</w:t>
+      </w:r>
+    </w:p>
+    <w:p>
+      <w:pPr>
+        <w:spacing w:before="120" w:after="30"/>
+      </w:pPr>
+      <w:r>
+        <w:rPr>
+          <w:b/>
+          <w:bCs/>
+          <w:color w:val="10314F"/>
+        </w:rPr>
+        <w:t>Airsume — Fully-Offline Resume Intelligence &amp; ATS Platform</w:t>
       </w:r>
       <w:r>
         <w:rPr>
@@ -2220,7 +2326,7 @@
           <w:sz w:val="18"/>
           <w:szCs w:val="18"/>
         </w:rPr>
-        <w:t>chitect &amp; developer</w:t>
+        <w:t xml:space="preserve">  ·  Independent research · sole architect &amp; developer</w:t>
       </w:r>
     </w:p>
     <w:p>
@@ -2243,73 +2349,81 @@
           <w:sz w:val="17"/>
           <w:szCs w:val="17"/>
         </w:rPr>
-        <w:t>Python · Django 5.2 · DRF · Celery · Redis · PostgreSQL · PyMuPDF / pdfplumber / python-docx · Tesseract OCR · RapidFuzz · Next.js 16 · React 19 · TypeScript</w:t>
-      </w:r>
-    </w:p>
-    <w:p>
-      <w:pPr>
-        <w:pStyle w:val="ListParagraph"/>
-        <w:numPr>
-          <w:ilvl w:val="0"/>
-          <w:numId w:val="2"/>
-        </w:numPr>
-        <w:spacing w:after="40" w:line="250" w:lineRule="auto"/>
-      </w:pPr>
-      <w:r>
-        <w:rPr>
-          <w:color w:val="1A1A1A"/>
-        </w:rPr>
-        <w:t>Built a resume and job-description analysis platform producing explaina</w:t>
-      </w:r>
-      <w:r>
-        <w:rPr>
-          <w:color w:val="1A1A1A"/>
-        </w:rPr>
-        <w:t>ble hiring intelligence with no LLM or cloud AI — every parsed field and score traces back to the exact text and rule that produced it, via a fully offline engine handling two-column layouts, tables and scanned PDFs through OCR.</w:t>
-      </w:r>
-    </w:p>
-    <w:p>
-      <w:pPr>
-        <w:pStyle w:val="ListParagraph"/>
-        <w:numPr>
-          <w:ilvl w:val="0"/>
-          <w:numId w:val="2"/>
-        </w:numPr>
-        <w:spacing w:after="40" w:line="250" w:lineRule="auto"/>
-      </w:pPr>
-      <w:r>
-        <w:rPr>
-          <w:color w:val="1A1A1A"/>
-        </w:rPr>
-        <w:t xml:space="preserve">Designed a versioned skill </w:t>
-      </w:r>
-      <w:r>
-        <w:rPr>
-          <w:color w:val="1A1A1A"/>
-        </w:rPr>
-        <w:t>taxonomy of 432 skills across 33 categories and 10 industries with typed aliases and weighted relationships, matched by a staged offline matcher (exact → alias → normalised → fuzzy, never fuzzy-first) that records how each match was made.</w:t>
-      </w:r>
-    </w:p>
-    <w:p>
-      <w:pPr>
-        <w:pStyle w:val="ListParagraph"/>
-        <w:numPr>
-          <w:ilvl w:val="0"/>
-          <w:numId w:val="2"/>
-        </w:numPr>
-        <w:spacing w:after="40" w:line="250" w:lineRule="auto"/>
-      </w:pPr>
-      <w:r>
-        <w:rPr>
-          <w:color w:val="1A1A1A"/>
-        </w:rPr>
-        <w:t xml:space="preserve">Engineered an explainable ATS scoring engine grading fit across six weighted categories with a neutralise-and-redistribute strategy for non-applicable criteria and a reconciliation invariant, running asynchronously on Celery with live status polling and a </w:t>
-      </w:r>
-      <w:r>
-        <w:rPr>
-          <w:color w:val="1A1A1A"/>
-        </w:rPr>
-        <w:t>golden-dataset benchmark harness keeping accuracy measurable.</w:t>
+        <w:t>Python · Django 5.2 · DRF · Celery · Redis · PostgreSQL · PyMuPDF / pdfplumber / python-docx · Tesseract OC</w:t>
+      </w:r>
+      <w:r>
+        <w:rPr>
+          <w:color w:val="4A4A4A"/>
+          <w:sz w:val="17"/>
+          <w:szCs w:val="17"/>
+        </w:rPr>
+        <w:t>R · RapidFuzz · Next.js 16 · React 19 · TypeScript</w:t>
+      </w:r>
+    </w:p>
+    <w:p>
+      <w:pPr>
+        <w:pStyle w:val="ListParagraph"/>
+        <w:numPr>
+          <w:ilvl w:val="0"/>
+          <w:numId w:val="2"/>
+        </w:numPr>
+        <w:spacing w:after="40" w:line="250" w:lineRule="auto"/>
+      </w:pPr>
+      <w:r>
+        <w:rPr>
+          <w:color w:val="1A1A1A"/>
+        </w:rPr>
+        <w:t>Built a resume and job-description analysis platform producing explainable hiring intelligence with no LLM or cloud AI — every parsed field and score traces back to the exact text and rule that produced it</w:t>
+      </w:r>
+      <w:r>
+        <w:rPr>
+          <w:color w:val="1A1A1A"/>
+        </w:rPr>
+        <w:t>, via a fully offline engine handling two-column layouts, tables and scanned PDFs through OCR.</w:t>
+      </w:r>
+    </w:p>
+    <w:p>
+      <w:pPr>
+        <w:pStyle w:val="ListParagraph"/>
+        <w:numPr>
+          <w:ilvl w:val="0"/>
+          <w:numId w:val="2"/>
+        </w:numPr>
+        <w:spacing w:after="40" w:line="250" w:lineRule="auto"/>
+      </w:pPr>
+      <w:r>
+        <w:rPr>
+          <w:color w:val="1A1A1A"/>
+        </w:rPr>
+        <w:t>Designed a versioned skill taxonomy of 432 skills across 33 categories and 10 industries with typed aliases and weighted relationships, matched by a staged offli</w:t>
+      </w:r>
+      <w:r>
+        <w:rPr>
+          <w:color w:val="1A1A1A"/>
+        </w:rPr>
+        <w:t>ne matcher (exact → alias → normalised → fuzzy, never fuzzy-first) that records how each match was made.</w:t>
+      </w:r>
+    </w:p>
+    <w:p>
+      <w:pPr>
+        <w:pStyle w:val="ListParagraph"/>
+        <w:numPr>
+          <w:ilvl w:val="0"/>
+          <w:numId w:val="2"/>
+        </w:numPr>
+        <w:spacing w:after="40" w:line="250" w:lineRule="auto"/>
+      </w:pPr>
+      <w:r>
+        <w:rPr>
+          <w:color w:val="1A1A1A"/>
+        </w:rPr>
+        <w:t xml:space="preserve">Engineered an explainable ATS scoring engine grading fit across six weighted categories with a neutralise-and-redistribute strategy for non-applicable </w:t>
+      </w:r>
+      <w:r>
+        <w:rPr>
+          <w:color w:val="1A1A1A"/>
+        </w:rPr>
+        <w:t>criteria and a reconciliation invariant, running asynchronously on Celery with live status polling and a golden-dataset benchmark harness keeping accuracy measurable.</w:t>
       </w:r>
     </w:p>
     <w:p>
@@ -2355,109 +2469,107 @@
           <w:sz w:val="17"/>
           <w:szCs w:val="17"/>
         </w:rPr>
-        <w:t>Python · Django 5 · DRF · Celery · Redis · PostgreSQL · Faster-Whisper ·</w:t>
-      </w:r>
-      <w:r>
-        <w:rPr>
-          <w:color w:val="4A4A4A"/>
-          <w:sz w:val="17"/>
-          <w:szCs w:val="17"/>
-        </w:rPr>
-        <w:t xml:space="preserve"> Ollama (Llama 3.2) · SpeechBrain ECAPA · FFmpeg · vector + full-text search · Next.js 16 · React 19 · TypeScript</w:t>
-      </w:r>
-    </w:p>
-    <w:p>
-      <w:pPr>
-        <w:pStyle w:val="ListParagraph"/>
-        <w:numPr>
-          <w:ilvl w:val="0"/>
-          <w:numId w:val="2"/>
-        </w:numPr>
-        <w:spacing w:after="40" w:line="250" w:lineRule="auto"/>
-      </w:pPr>
-      <w:r>
-        <w:rPr>
-          <w:color w:val="1A1A1A"/>
-        </w:rPr>
-        <w:t>Built a meeting-assistant platform turning raw audio and video into transcripts, grounded summaries, tracked work and organisational knowledge</w:t>
-      </w:r>
-      <w:r>
-        <w:rPr>
-          <w:color w:val="1A1A1A"/>
-        </w:rPr>
-        <w:t xml:space="preserve"> — running entirely locally with no paid APIs, cloud AI or commercial SDKs, every AI capability behind a provider interface defaulting to a local engine.</w:t>
-      </w:r>
-    </w:p>
-    <w:p>
-      <w:pPr>
-        <w:pStyle w:val="ListParagraph"/>
-        <w:numPr>
-          <w:ilvl w:val="0"/>
-          <w:numId w:val="2"/>
-        </w:numPr>
-        <w:spacing w:after="40" w:line="250" w:lineRule="auto"/>
-      </w:pPr>
-      <w:r>
-        <w:rPr>
-          <w:color w:val="1A1A1A"/>
-        </w:rPr>
-        <w:t>Engineered an asynchronous Celery pipeline (validate → extract → normalise → transcribe → diarise → su</w:t>
-      </w:r>
-      <w:r>
-        <w:rPr>
-          <w:color w:val="1A1A1A"/>
-        </w:rPr>
-        <w:t>mmarise → index) with graceful degradation so a failed AI step never discards a good transcript, plus a reusable domain-agnostic job engine with dependency-graph ordering, exponential-backoff retry, idempotent resume and live progress.</w:t>
-      </w:r>
-    </w:p>
-    <w:p>
-      <w:pPr>
-        <w:pStyle w:val="ListParagraph"/>
-        <w:numPr>
-          <w:ilvl w:val="0"/>
-          <w:numId w:val="2"/>
-        </w:numPr>
-        <w:spacing w:after="40" w:line="250" w:lineRule="auto"/>
-      </w:pPr>
-      <w:r>
-        <w:rPr>
-          <w:color w:val="1A1A1A"/>
-        </w:rPr>
-        <w:t>Implemented grounded</w:t>
-      </w:r>
-      <w:r>
-        <w:rPr>
-          <w:color w:val="1A1A1A"/>
-        </w:rPr>
-        <w:t xml:space="preserve"> RAG chat over hybrid retrieval (local embeddings, Postgres full-text, recency) returning clickable-timestamp citations and refusing to answer beyond source material, and speaker diarisation via SpeechBrain ECAPA embeddings with a cross-meeting voice regis</w:t>
-      </w:r>
-      <w:r>
-        <w:rPr>
-          <w:color w:val="1A1A1A"/>
-        </w:rPr>
-        <w:t>try recognising recurring speakers through tiered similarity matching.</w:t>
-      </w:r>
-    </w:p>
-    <w:p>
-      <w:pPr>
-        <w:pStyle w:val="ListParagraph"/>
-        <w:numPr>
-          <w:ilvl w:val="0"/>
-          <w:numId w:val="2"/>
-        </w:numPr>
-        <w:spacing w:after="40" w:line="250" w:lineRule="auto"/>
-      </w:pPr>
-      <w:r>
-        <w:rPr>
-          <w:color w:val="1A1A1A"/>
-        </w:rPr>
-        <w:t>Designed a bitemporal, event-sourced knowledge hub with time-travel queries, decision-evolution history and conflict detection, feeding an executive dashboard materialised incrementally rather than recomputed per request, alongside a 12-agent platform acce</w:t>
-      </w:r>
-      <w:r>
-        <w:rPr>
-          <w:color w:val="1A1A1A"/>
-        </w:rPr>
-        <w:t>ssing data only through a permissioned tool registry with human approval gates.</w:t>
+        <w:t>Python · Django 5 · DRF · Celery · Redis · PostgreSQL · Faster-Whisper · Ollama (Llama 3.2) · SpeechBrain ECAPA · FFmpeg · vector + full-text search · Next.js 16 · React 19 · TypeScript</w:t>
+      </w:r>
+    </w:p>
+    <w:p>
+      <w:pPr>
+        <w:pStyle w:val="ListParagraph"/>
+        <w:numPr>
+          <w:ilvl w:val="0"/>
+          <w:numId w:val="2"/>
+        </w:numPr>
+        <w:spacing w:after="40" w:line="250" w:lineRule="auto"/>
+      </w:pPr>
+      <w:r>
+        <w:rPr>
+          <w:color w:val="1A1A1A"/>
+        </w:rPr>
+        <w:t xml:space="preserve">Built a </w:t>
+      </w:r>
+      <w:r>
+        <w:rPr>
+          <w:color w:val="1A1A1A"/>
+        </w:rPr>
+        <w:t>meeting-assistant platform turning raw audio and video into transcripts, grounded summaries, tracked work and organisational knowledge — running entirely locally with no paid APIs, cloud AI or commercial SDKs, every AI capability behind a provider interfac</w:t>
+      </w:r>
+      <w:r>
+        <w:rPr>
+          <w:color w:val="1A1A1A"/>
+        </w:rPr>
+        <w:t>e defaulting to a local engine.</w:t>
+      </w:r>
+    </w:p>
+    <w:p>
+      <w:pPr>
+        <w:pStyle w:val="ListParagraph"/>
+        <w:numPr>
+          <w:ilvl w:val="0"/>
+          <w:numId w:val="2"/>
+        </w:numPr>
+        <w:spacing w:after="40" w:line="250" w:lineRule="auto"/>
+      </w:pPr>
+      <w:r>
+        <w:rPr>
+          <w:color w:val="1A1A1A"/>
+        </w:rPr>
+        <w:t>Engineered an asynchronous Celery pipeline (validate → extract → normalise → transcribe → diarise → summarise → index) with graceful degradation so a failed AI step never discards a good transcript, plus a reusable domain-ag</w:t>
+      </w:r>
+      <w:r>
+        <w:rPr>
+          <w:color w:val="1A1A1A"/>
+        </w:rPr>
+        <w:t>nostic job engine with dependency-graph ordering, exponential-backoff retry, idempotent resume and live progress.</w:t>
+      </w:r>
+    </w:p>
+    <w:p>
+      <w:pPr>
+        <w:pStyle w:val="ListParagraph"/>
+        <w:numPr>
+          <w:ilvl w:val="0"/>
+          <w:numId w:val="2"/>
+        </w:numPr>
+        <w:spacing w:after="40" w:line="250" w:lineRule="auto"/>
+      </w:pPr>
+      <w:r>
+        <w:rPr>
+          <w:color w:val="1A1A1A"/>
+        </w:rPr>
+        <w:t>Implemented grounded RAG chat over hybrid retrieval (local embeddings, Postgres full-text, recency) returning clickable-timestamp citations an</w:t>
+      </w:r>
+      <w:r>
+        <w:rPr>
+          <w:color w:val="1A1A1A"/>
+        </w:rPr>
+        <w:t>d refusing to answer beyond source material, and speaker diarisation via SpeechBrain ECAPA embeddings with a cross-meeting voice registry recognising recurring speakers through tiered similarity matching.</w:t>
+      </w:r>
+    </w:p>
+    <w:p>
+      <w:pPr>
+        <w:pStyle w:val="ListParagraph"/>
+        <w:numPr>
+          <w:ilvl w:val="0"/>
+          <w:numId w:val="2"/>
+        </w:numPr>
+        <w:spacing w:after="40" w:line="250" w:lineRule="auto"/>
+      </w:pPr>
+      <w:r>
+        <w:rPr>
+          <w:color w:val="1A1A1A"/>
+        </w:rPr>
+        <w:t xml:space="preserve">Designed a bitemporal, event-sourced knowledge hub </w:t>
+      </w:r>
+      <w:r>
+        <w:rPr>
+          <w:color w:val="1A1A1A"/>
+        </w:rPr>
+        <w:t>with time-travel queries, decision-evolution history and conflict detection, feeding an executive dashboard materialised incrementally rather than recomputed per request, alongside a 12-agent platform accessing data only through a permissioned tool registr</w:t>
+      </w:r>
+      <w:r>
+        <w:rPr>
+          <w:color w:val="1A1A1A"/>
+        </w:rPr>
+        <w:t>y with human approval gates.</w:t>
       </w:r>
     </w:p>
     <w:p>
@@ -2506,97 +2618,91 @@
           <w:sz w:val="17"/>
           <w:szCs w:val="17"/>
         </w:rPr>
-        <w:t>Next.js 14 · TypeScrip</w:t>
-      </w:r>
-      <w:r>
-        <w:rPr>
-          <w:color w:val="4A4A4A"/>
-          <w:sz w:val="17"/>
-          <w:szCs w:val="17"/>
-        </w:rPr>
-        <w:t>t · Django REST Framework · PostgreSQL · Redis · WebSockets · JWT</w:t>
-      </w:r>
-    </w:p>
-    <w:p>
-      <w:pPr>
-        <w:pStyle w:val="ListParagraph"/>
-        <w:numPr>
-          <w:ilvl w:val="0"/>
-          <w:numId w:val="2"/>
-        </w:numPr>
-        <w:spacing w:after="40" w:line="250" w:lineRule="auto"/>
-      </w:pPr>
-      <w:r>
-        <w:rPr>
-          <w:color w:val="1A1A1A"/>
-        </w:rPr>
-        <w:t>Architected an enterprise hospital operating system unifying patient management, EMR, pharmacy, laboratory, nursing and ward management, billing, staff administration and analytics into a si</w:t>
-      </w:r>
-      <w:r>
-        <w:rPr>
-          <w:color w:val="1A1A1A"/>
-        </w:rPr>
-        <w:t>ngle platform.</w:t>
-      </w:r>
-    </w:p>
-    <w:p>
-      <w:pPr>
-        <w:pStyle w:val="ListParagraph"/>
-        <w:numPr>
-          <w:ilvl w:val="0"/>
-          <w:numId w:val="2"/>
-        </w:numPr>
-        <w:spacing w:after="40" w:line="250" w:lineRule="auto"/>
-      </w:pPr>
-      <w:r>
-        <w:rPr>
-          <w:color w:val="1A1A1A"/>
-        </w:rPr>
-        <w:t>Implemented granular role-based access control across eight distinct roles — doctors, nurses, pharmacists, lab technicians, accountants, receptionists and administrators — on top of JWT authentication.</w:t>
-      </w:r>
-    </w:p>
-    <w:p>
-      <w:pPr>
-        <w:pStyle w:val="ListParagraph"/>
-        <w:numPr>
-          <w:ilvl w:val="0"/>
-          <w:numId w:val="2"/>
-        </w:numPr>
-        <w:spacing w:after="40" w:line="250" w:lineRule="auto"/>
-      </w:pPr>
-      <w:r>
-        <w:rPr>
-          <w:color w:val="1A1A1A"/>
-        </w:rPr>
-        <w:t xml:space="preserve">Delivered real-time clinical workflows </w:t>
-      </w:r>
-      <w:r>
-        <w:rPr>
-          <w:color w:val="1A1A1A"/>
-        </w:rPr>
-        <w:t>over WebSockets: lab result delivery, pharmacy low-stock alerts, emergency notifications and live bed-occupancy changes.</w:t>
-      </w:r>
-    </w:p>
-    <w:p>
-      <w:pPr>
-        <w:pStyle w:val="ListParagraph"/>
-        <w:numPr>
-          <w:ilvl w:val="0"/>
-          <w:numId w:val="2"/>
-        </w:numPr>
-        <w:spacing w:after="40" w:line="250" w:lineRule="auto"/>
-      </w:pPr>
-      <w:r>
-        <w:rPr>
-          <w:color w:val="1A1A1A"/>
-        </w:rPr>
-        <w:t>Built an analytics layer surfacing operational KPIs, revenue analysis and occupancy statistics, backed by PostgreSQL with Redis caching</w:t>
-      </w:r>
-      <w:r>
-        <w:rPr>
-          <w:color w:val="1A1A1A"/>
-        </w:rPr>
-        <w:t xml:space="preserve"> for read-heavy dashboards.</w:t>
+        <w:t>Next.js 14 · TypeScript · Django REST Framework · PostgreSQL · Redis · We</w:t>
+      </w:r>
+      <w:r>
+        <w:rPr>
+          <w:color w:val="4A4A4A"/>
+          <w:sz w:val="17"/>
+          <w:szCs w:val="17"/>
+        </w:rPr>
+        <w:t>bSockets · JWT</w:t>
+      </w:r>
+    </w:p>
+    <w:p>
+      <w:pPr>
+        <w:pStyle w:val="ListParagraph"/>
+        <w:numPr>
+          <w:ilvl w:val="0"/>
+          <w:numId w:val="2"/>
+        </w:numPr>
+        <w:spacing w:after="40" w:line="250" w:lineRule="auto"/>
+      </w:pPr>
+      <w:r>
+        <w:rPr>
+          <w:color w:val="1A1A1A"/>
+        </w:rPr>
+        <w:t>Architected an enterprise hospital operating system unifying patient management, EMR, pharmacy, laboratory, nursing and ward management, billing, staff administration and analytics into a single platform.</w:t>
+      </w:r>
+    </w:p>
+    <w:p>
+      <w:pPr>
+        <w:pStyle w:val="ListParagraph"/>
+        <w:numPr>
+          <w:ilvl w:val="0"/>
+          <w:numId w:val="2"/>
+        </w:numPr>
+        <w:spacing w:after="40" w:line="250" w:lineRule="auto"/>
+      </w:pPr>
+      <w:r>
+        <w:rPr>
+          <w:color w:val="1A1A1A"/>
+        </w:rPr>
+        <w:t>Implemented granular role-based acce</w:t>
+      </w:r>
+      <w:r>
+        <w:rPr>
+          <w:color w:val="1A1A1A"/>
+        </w:rPr>
+        <w:t>ss control across eight distinct roles — doctors, nurses, pharmacists, lab technicians, accountants, receptionists and administrators — on top of JWT authentication.</w:t>
+      </w:r>
+    </w:p>
+    <w:p>
+      <w:pPr>
+        <w:pStyle w:val="ListParagraph"/>
+        <w:numPr>
+          <w:ilvl w:val="0"/>
+          <w:numId w:val="2"/>
+        </w:numPr>
+        <w:spacing w:after="40" w:line="250" w:lineRule="auto"/>
+      </w:pPr>
+      <w:r>
+        <w:rPr>
+          <w:color w:val="1A1A1A"/>
+        </w:rPr>
+        <w:t>Delivered real-time clinical workflows over WebSockets: lab result delivery, pharmacy low-</w:t>
+      </w:r>
+      <w:r>
+        <w:rPr>
+          <w:color w:val="1A1A1A"/>
+        </w:rPr>
+        <w:t>stock alerts, emergency notifications and live bed-occupancy changes.</w:t>
+      </w:r>
+    </w:p>
+    <w:p>
+      <w:pPr>
+        <w:pStyle w:val="ListParagraph"/>
+        <w:numPr>
+          <w:ilvl w:val="0"/>
+          <w:numId w:val="2"/>
+        </w:numPr>
+        <w:spacing w:after="40" w:line="250" w:lineRule="auto"/>
+      </w:pPr>
+      <w:r>
+        <w:rPr>
+          <w:color w:val="1A1A1A"/>
+        </w:rPr>
+        <w:t>Built an analytics layer surfacing operational KPIs, revenue analysis and occupancy statistics, backed by PostgreSQL with Redis caching for read-heavy dashboards.</w:t>
       </w:r>
     </w:p>
     <w:p>
@@ -2645,15 +2751,15 @@
           <w:sz w:val="17"/>
           <w:szCs w:val="17"/>
         </w:rPr>
-        <w:t>Flutter (Riverpod, Freezed, Dio, GoRouter) · Django REST Framework · PostgreSQL · Redi</w:t>
-      </w:r>
-      <w:r>
-        <w:rPr>
-          <w:color w:val="4A4A4A"/>
-          <w:sz w:val="17"/>
-          <w:szCs w:val="17"/>
-        </w:rPr>
-        <w:t>s · Celery · Django Channels · Stripe · FCM · Google Maps</w:t>
+        <w:t>Flutter (Riverpod, Freezed, Dio, GoRouter) · Django REST Framework · PostgreSQL · Redis · Celery · Django Channels · Stripe · FCM · Googl</w:t>
+      </w:r>
+      <w:r>
+        <w:rPr>
+          <w:color w:val="4A4A4A"/>
+          <w:sz w:val="17"/>
+          <w:szCs w:val="17"/>
+        </w:rPr>
+        <w:t>e Maps</w:t>
       </w:r>
     </w:p>
     <w:p>
@@ -2685,51 +2791,51 @@
         <w:rPr>
           <w:color w:val="1A1A1A"/>
         </w:rPr>
-        <w:t>Implemented</w:t>
-      </w:r>
-      <w:r>
-        <w:rPr>
-          <w:color w:val="1A1A1A"/>
-        </w:rPr>
-        <w:t xml:space="preserve"> live booking tracking via WebSockets and Google Maps, with passwordless OTP authentication and automatic JWT token refresh.</w:t>
-      </w:r>
-    </w:p>
-    <w:p>
-      <w:pPr>
-        <w:pStyle w:val="ListParagraph"/>
-        <w:numPr>
-          <w:ilvl w:val="0"/>
-          <w:numId w:val="2"/>
-        </w:numPr>
-        <w:spacing w:after="40" w:line="250" w:lineRule="auto"/>
-      </w:pPr>
-      <w:r>
-        <w:rPr>
-          <w:color w:val="1A1A1A"/>
-        </w:rPr>
-        <w:t>Offloaded scheduled jobs, notification dispatch and payment processing to Celery workers backed by Redis, keeping request latency i</w:t>
-      </w:r>
-      <w:r>
-        <w:rPr>
-          <w:color w:val="1A1A1A"/>
-        </w:rPr>
-        <w:t>ndependent of background workload.</w:t>
-      </w:r>
-    </w:p>
-    <w:p>
-      <w:pPr>
-        <w:pStyle w:val="ListParagraph"/>
-        <w:numPr>
-          <w:ilvl w:val="0"/>
-          <w:numId w:val="2"/>
-        </w:numPr>
-        <w:spacing w:after="40" w:line="250" w:lineRule="auto"/>
-      </w:pPr>
-      <w:r>
-        <w:rPr>
-          <w:color w:val="1A1A1A"/>
-        </w:rPr>
-        <w:t>Delivered an operations dashboard for booking, staff, attendance and schedule management, plus revenue and service-utilisation reporting.</w:t>
+        <w:t>Implemented live booking tracking via WebSockets and Google Ma</w:t>
+      </w:r>
+      <w:r>
+        <w:rPr>
+          <w:color w:val="1A1A1A"/>
+        </w:rPr>
+        <w:t>ps, with passwordless OTP authentication and automatic JWT token refresh.</w:t>
+      </w:r>
+    </w:p>
+    <w:p>
+      <w:pPr>
+        <w:pStyle w:val="ListParagraph"/>
+        <w:numPr>
+          <w:ilvl w:val="0"/>
+          <w:numId w:val="2"/>
+        </w:numPr>
+        <w:spacing w:after="40" w:line="250" w:lineRule="auto"/>
+      </w:pPr>
+      <w:r>
+        <w:rPr>
+          <w:color w:val="1A1A1A"/>
+        </w:rPr>
+        <w:t>Offloaded scheduled jobs, notification dispatch and payment processing to Celery workers backed by Redis, keeping request latency independent of background workload.</w:t>
+      </w:r>
+    </w:p>
+    <w:p>
+      <w:pPr>
+        <w:pStyle w:val="ListParagraph"/>
+        <w:numPr>
+          <w:ilvl w:val="0"/>
+          <w:numId w:val="2"/>
+        </w:numPr>
+        <w:spacing w:after="40" w:line="250" w:lineRule="auto"/>
+      </w:pPr>
+      <w:r>
+        <w:rPr>
+          <w:color w:val="1A1A1A"/>
+        </w:rPr>
+        <w:t>Delivered an ope</w:t>
+      </w:r>
+      <w:r>
+        <w:rPr>
+          <w:color w:val="1A1A1A"/>
+        </w:rPr>
+        <w:t>rations dashboard for booking, staff, attendance and schedule management, plus revenue and service-utilisation reporting.</w:t>
       </w:r>
     </w:p>
     <w:p>
@@ -2744,7 +2850,7 @@
             <w:color w:val="10314F"/>
             <w:u w:val="single"/>
           </w:rPr>
-          <w:t>ShieldDNS v2.0 — Cro</w:t>
+          <w:t>ShieldDNS v2.0 — Cross-Platform Ad, Tracker &amp; Malware Blocking Ecosyste</w:t>
         </w:r>
         <w:r>
           <w:rPr>
@@ -2753,7 +2859,7 @@
             <w:color w:val="10314F"/>
             <w:u w:val="single"/>
           </w:rPr>
-          <w:t>ss-Platform Ad, Tracker &amp; Malware Blocking Ecosystem</w:t>
+          <w:t>m</w:t>
         </w:r>
       </w:hyperlink>
       <w:r>
@@ -2803,19 +2909,13 @@
         <w:rPr>
           <w:color w:val="1A1A1A"/>
         </w:rPr>
-        <w:t>Designe</w:t>
-      </w:r>
-      <w:r>
-        <w:rPr>
-          <w:color w:val="1A1A1A"/>
-        </w:rPr>
-        <w:t>d and shipped a three-platform blocking ecosystem — an Android VPN-based DNS filter, a Windows local DNS server and a Manifest V3 browser extension — filtering ads, trackers, malware and redirect scams entirely on-device with no accounts, telemetry or thir</w:t>
-      </w:r>
-      <w:r>
-        <w:rPr>
-          <w:color w:val="1A1A1A"/>
-        </w:rPr>
-        <w:t>d-party routing.</w:t>
+        <w:t>Designed and shipped a three-platform blocking ecosystem — an Android VPN-based DNS filter, a Windows local DNS serv</w:t>
+      </w:r>
+      <w:r>
+        <w:rPr>
+          <w:color w:val="1A1A1A"/>
+        </w:rPr>
+        <w:t>er and a Manifest V3 browser extension — filtering ads, trackers, malware and redirect scams entirely on-device with no accounts, telemetry or third-party routing.</w:t>
       </w:r>
     </w:p>
     <w:p>
@@ -2847,63 +2947,57 @@
         <w:rPr>
           <w:color w:val="1A1A1A"/>
         </w:rPr>
-        <w:t>Built behavioural de</w:t>
-      </w:r>
-      <w:r>
-        <w:rPr>
-          <w:color w:val="1A1A1A"/>
-        </w:rPr>
-        <w:t>tection beyond static lists: CNAME uncloaking across every chain hop, a live 0–100 domain reputation score from subdomain entropy, risky TLDs, homoglyph detection and visit frequency with time-based decay, and multi-hop redirect-chain reconstruction scored</w:t>
-      </w:r>
-      <w:r>
-        <w:rPr>
-          <w:color w:val="1A1A1A"/>
-        </w:rPr>
-        <w:t xml:space="preserve"> by hop count, /24 IP diversity and inter-hop timing.</w:t>
-      </w:r>
-    </w:p>
-    <w:p>
-      <w:pPr>
-        <w:pStyle w:val="ListParagraph"/>
-        <w:numPr>
-          <w:ilvl w:val="0"/>
-          <w:numId w:val="2"/>
-        </w:numPr>
-        <w:spacing w:after="40" w:line="250" w:lineRule="auto"/>
-      </w:pPr>
-      <w:r>
-        <w:rPr>
-          <w:color w:val="1A1A1A"/>
-        </w:rPr>
-        <w:t>Implemented encrypted DoH/DoT upstream resolution with compiled bootstrap IPs to avoid pre-tunnel resolution deadlock, a DNS-layer per-app firewall across Wi-Fi, mobile data and roaming, and three tiere</w:t>
-      </w:r>
-      <w:r>
-        <w:rPr>
-          <w:color w:val="1A1A1A"/>
-        </w:rPr>
-        <w:t>d shield presets trading false-positive rate against aggressiveness.</w:t>
-      </w:r>
-    </w:p>
-    <w:p>
-      <w:pPr>
-        <w:pStyle w:val="ListParagraph"/>
-        <w:numPr>
-          <w:ilvl w:val="0"/>
-          <w:numId w:val="2"/>
-        </w:numPr>
-        <w:spacing w:after="40" w:line="250" w:lineRule="auto"/>
-      </w:pPr>
-      <w:r>
-        <w:rPr>
-          <w:color w:val="1A1A1A"/>
-        </w:rPr>
-        <w:t>Owned full release engineering — R8 shrinking, certificate pinning, split debug/release signing, Windows installer packaging, and automated blocklist refresh via WorkManager with boot per</w:t>
-      </w:r>
-      <w:r>
-        <w:rPr>
-          <w:color w:val="1A1A1A"/>
-        </w:rPr>
-        <w:t>sistence.</w:t>
+        <w:t>Built behavioural detection beyond st</w:t>
+      </w:r>
+      <w:r>
+        <w:rPr>
+          <w:color w:val="1A1A1A"/>
+        </w:rPr>
+        <w:t>atic lists: CNAME uncloaking across every chain hop, a live 0–100 domain reputation score from subdomain entropy, risky TLDs, homoglyph detection and visit frequency with time-based decay, and multi-hop redirect-chain reconstruction scored by hop count, /2</w:t>
+      </w:r>
+      <w:r>
+        <w:rPr>
+          <w:color w:val="1A1A1A"/>
+        </w:rPr>
+        <w:t>4 IP diversity and inter-hop timing.</w:t>
+      </w:r>
+    </w:p>
+    <w:p>
+      <w:pPr>
+        <w:pStyle w:val="ListParagraph"/>
+        <w:numPr>
+          <w:ilvl w:val="0"/>
+          <w:numId w:val="2"/>
+        </w:numPr>
+        <w:spacing w:after="40" w:line="250" w:lineRule="auto"/>
+      </w:pPr>
+      <w:r>
+        <w:rPr>
+          <w:color w:val="1A1A1A"/>
+        </w:rPr>
+        <w:t xml:space="preserve">Implemented encrypted DoH/DoT upstream resolution with compiled bootstrap IPs to avoid pre-tunnel resolution deadlock, a DNS-layer per-app firewall across Wi-Fi, mobile data and roaming, and three tiered shield presets </w:t>
+      </w:r>
+      <w:r>
+        <w:rPr>
+          <w:color w:val="1A1A1A"/>
+        </w:rPr>
+        <w:t>trading false-positive rate against aggressiveness.</w:t>
+      </w:r>
+    </w:p>
+    <w:p>
+      <w:pPr>
+        <w:pStyle w:val="ListParagraph"/>
+        <w:numPr>
+          <w:ilvl w:val="0"/>
+          <w:numId w:val="2"/>
+        </w:numPr>
+        <w:spacing w:after="40" w:line="250" w:lineRule="auto"/>
+      </w:pPr>
+      <w:r>
+        <w:rPr>
+          <w:color w:val="1A1A1A"/>
+        </w:rPr>
+        <w:t>Owned full release engineering — R8 shrinking, certificate pinning, split debug/release signing, Windows installer packaging, and automated blocklist refresh via WorkManager with boot persistence.</w:t>
       </w:r>
     </w:p>
     <w:p>
@@ -2968,7 +3062,13 @@
         <w:rPr>
           <w:color w:val="1A1A1A"/>
         </w:rPr>
-        <w:t>Delivered role-separated dashboards for teachers and students covering attendance capture, marks entry, class and subject management and in-app notifications, replacing manual record-keeping.</w:t>
+        <w:t>Delivered role-separated dashboards for te</w:t>
+      </w:r>
+      <w:r>
+        <w:rPr>
+          <w:color w:val="1A1A1A"/>
+        </w:rPr>
+        <w:t>achers and students covering attendance capture, marks entry, class and subject management and in-app notifications, replacing manual record-keeping.</w:t>
       </w:r>
     </w:p>
     <w:p>
@@ -2994,7 +3094,17 @@
           <w:sz w:val="18"/>
           <w:szCs w:val="18"/>
         </w:rPr>
-        <w:t xml:space="preserve">  ·  Full-stack web application</w:t>
+        <w:t xml:space="preserve">  · </w:t>
+      </w:r>
+      <w:r>
+        <w:rPr>
+          <w:i/>
+          <w:iCs/>
+          <w:color w:val="4A4A4A"/>
+          <w:sz w:val="18"/>
+          <w:szCs w:val="18"/>
+        </w:rPr>
+        <w:t xml:space="preserve"> Full-stack web application</w:t>
       </w:r>
     </w:p>
     <w:p>
@@ -3033,13 +3143,13 @@
         <w:rPr>
           <w:color w:val="1A1A1A"/>
         </w:rPr>
-        <w:t>Built stock, seller and sales management with auto-updating inventory levels, configurable low-stock a</w:t>
-      </w:r>
-      <w:r>
-        <w:rPr>
-          <w:color w:val="1A1A1A"/>
-        </w:rPr>
-        <w:t>lerts and an analytics dashboard reporting revenue trends, top sellers and stock availability.</w:t>
+        <w:t>Built stock, seller and sales management with auto-updating inventory levels, configurable low-stock alerts and an analytics dashboard reporting revenue trends, top sellers and stock availa</w:t>
+      </w:r>
+      <w:r>
+        <w:rPr>
+          <w:color w:val="1A1A1A"/>
+        </w:rPr>
+        <w:t>bility.</w:t>
       </w:r>
     </w:p>
     <w:p>
@@ -3088,31 +3198,29 @@
           <w:sz w:val="17"/>
           <w:szCs w:val="17"/>
         </w:rPr>
-        <w:t>Django · We</w:t>
-      </w:r>
-      <w:r>
-        <w:rPr>
-          <w:color w:val="4A4A4A"/>
-          <w:sz w:val="17"/>
-          <w:szCs w:val="17"/>
-        </w:rPr>
-        <w:t>bSockets · MySQL · Maps API</w:t>
-      </w:r>
-    </w:p>
-    <w:p>
-      <w:pPr>
-        <w:pStyle w:val="ListParagraph"/>
-        <w:numPr>
-          <w:ilvl w:val="0"/>
-          <w:numId w:val="2"/>
-        </w:numPr>
-        <w:spacing w:after="40" w:line="250" w:lineRule="auto"/>
-      </w:pPr>
-      <w:r>
-        <w:rPr>
-          <w:color w:val="1A1A1A"/>
-        </w:rPr>
-        <w:t>Developed map-based crime reporting with proximity alerts, real-time chat between users and authorities, an SOS contact broadcast and admin-defined risk-graded danger zones.</w:t>
+        <w:t>Django · WebSockets · MySQL · Maps API</w:t>
+      </w:r>
+    </w:p>
+    <w:p>
+      <w:pPr>
+        <w:pStyle w:val="ListParagraph"/>
+        <w:numPr>
+          <w:ilvl w:val="0"/>
+          <w:numId w:val="2"/>
+        </w:numPr>
+        <w:spacing w:after="40" w:line="250" w:lineRule="auto"/>
+      </w:pPr>
+      <w:r>
+        <w:rPr>
+          <w:color w:val="1A1A1A"/>
+        </w:rPr>
+        <w:t xml:space="preserve">Developed map-based crime reporting with proximity alerts, </w:t>
+      </w:r>
+      <w:r>
+        <w:rPr>
+          <w:color w:val="1A1A1A"/>
+        </w:rPr>
+        <w:t>real-time chat between users and authorities, an SOS contact broadcast and admin-defined risk-graded danger zones.</w:t>
       </w:r>
     </w:p>
     <w:p>
@@ -3153,7 +3261,17 @@
           <w:sz w:val="17"/>
           <w:szCs w:val="17"/>
         </w:rPr>
-        <w:t xml:space="preserve">Stack: </w:t>
+        <w:t>Stac</w:t>
+      </w:r>
+      <w:r>
+        <w:rPr>
+          <w:b/>
+          <w:bCs/>
+          <w:color w:val="1B6E8C"/>
+          <w:sz w:val="17"/>
+          <w:szCs w:val="17"/>
+        </w:rPr>
+        <w:t xml:space="preserve">k: </w:t>
       </w:r>
       <w:r>
         <w:rPr>
@@ -3177,13 +3295,7 @@
         <w:rPr>
           <w:color w:val="1A1A1A"/>
         </w:rPr>
-        <w:t>Cafeteria operations platform with role-separated access, menu management, order processing with automated email noti</w:t>
-      </w:r>
-      <w:r>
-        <w:rPr>
-          <w:color w:val="1A1A1A"/>
-        </w:rPr>
-        <w:t>fication, and integrated nutritional tracking by calories and food type.</w:t>
+        <w:t>Cafeteria operations platform with role-separated access, menu management, order processing with automated email notification, and integrated nutritional tracking by calories and food type.</w:t>
       </w:r>
     </w:p>
     <w:p>
@@ -3253,7 +3365,13 @@
         <w:rPr>
           <w:color w:val="1A1A1A"/>
         </w:rPr>
-        <w:t>Codeathon Event Project — IBM Certification, SLA Institute, Chennai</w:t>
+        <w:t>Codeathon Event Project — IBM Certification, SLA Institute, Ch</w:t>
+      </w:r>
+      <w:r>
+        <w:rPr>
+          <w:color w:val="1A1A1A"/>
+        </w:rPr>
+        <w:t>ennai</w:t>
       </w:r>
     </w:p>
     <w:p>
@@ -3348,21 +3466,38 @@
           <w:bCs/>
           <w:color w:val="10314F"/>
         </w:rPr>
-        <w:t>Lang</w:t>
-      </w:r>
+        <w:t xml:space="preserve">Languages  </w:t>
+      </w:r>
+      <w:r>
+        <w:rPr>
+          <w:color w:val="1A1A1A"/>
+        </w:rPr>
+        <w:t>English (professional working proficiency — primary language of all client delivery), Tamil (native).</w:t>
+      </w:r>
+    </w:p>
+    <w:p>
+      <w:pPr>
+        <w:spacing w:after="50" w:line="250" w:lineRule="auto"/>
+      </w:pPr>
       <w:r>
         <w:rPr>
           <w:b/>
           <w:bCs/>
           <w:color w:val="10314F"/>
         </w:rPr>
-        <w:t xml:space="preserve">uages  </w:t>
-      </w:r>
-      <w:r>
-        <w:rPr>
-          <w:color w:val="1A1A1A"/>
-        </w:rPr>
-        <w:t>English (professional working proficiency — primary language of all client delivery), Tamil (native).</w:t>
+        <w:t xml:space="preserve">Strengths  </w:t>
+      </w:r>
+      <w:r>
+        <w:rPr>
+          <w:color w:val="1A1A1A"/>
+        </w:rPr>
+        <w:t>Sole-owner product delivery, direct stakeholder communication, rapid onboarding to unfamiliar stacks, debugging and performance optimisation, s</w:t>
+      </w:r>
+      <w:r>
+        <w:rPr>
+          <w:color w:val="1A1A1A"/>
+        </w:rPr>
+        <w:t>ecurity-first implementation.</w:t>
       </w:r>
     </w:p>
     <w:p>
@@ -3375,31 +3510,6 @@
           <w:bCs/>
           <w:color w:val="10314F"/>
         </w:rPr>
-        <w:t xml:space="preserve">Strengths  </w:t>
-      </w:r>
-      <w:r>
-        <w:rPr>
-          <w:color w:val="1A1A1A"/>
-        </w:rPr>
-        <w:t>Sole-owner product delivery, direct stakeholder communication, rapid onboarding to unfamiliar stacks, debugging and performance optimisa</w:t>
-      </w:r>
-      <w:r>
-        <w:rPr>
-          <w:color w:val="1A1A1A"/>
-        </w:rPr>
-        <w:t>tion, security-first implementation.</w:t>
-      </w:r>
-    </w:p>
-    <w:p>
-      <w:pPr>
-        <w:spacing w:after="50" w:line="250" w:lineRule="auto"/>
-      </w:pPr>
-      <w:r>
-        <w:rPr>
-          <w:b/>
-          <w:bCs/>
-          <w:color w:val="10314F"/>
-        </w:rPr>
         <w:t xml:space="preserve">References  </w:t>
       </w:r>
       <w:r>
@@ -3408,7 +3518,6 @@
         </w:rPr>
         <w:t>Available on request.</w:t>
       </w:r>
-      <w:bookmarkEnd w:id="0"/>
     </w:p>
     <w:sectPr>
       <w:pgSz w:w="11906" w:h="16838"/>
@@ -3423,10 +3532,96 @@
 <file path=word/numbering.xml><?xml version="1.0" encoding="utf-8"?>
 <w:numbering xmlns:wpc="http://schemas.microsoft.com/office/word/2010/wordprocessingCanvas" xmlns:cx="http://schemas.microsoft.com/office/drawing/2014/chartex" xmlns:cx1="http://schemas.microsoft.com/office/drawing/2015/9/8/chartex" xmlns:cx2="http://schemas.microsoft.com/office/drawing/2015/10/21/chartex" xmlns:cx3="http://schemas.microsoft.com/office/drawing/2016/5/9/chartex" xmlns:cx4="http://schemas.microsoft.com/office/drawing/2016/5/10/chartex" xmlns:cx5="http://schemas.microsoft.com/office/drawing/2016/5/11/chartex" xmlns:cx6="http://schemas.microsoft.com/office/drawing/2016/5/12/chartex" xmlns:cx7="http://schemas.microsoft.com/office/drawing/2016/5/13/chartex" xmlns:cx8="http://schemas.microsoft.com/office/drawing/2016/5/14/chartex" xmlns:mc="http://schemas.openxmlformats.org/markup-compatibility/2006" xmlns:aink="http://schemas.microsoft.com/office/drawing/2016/ink" xmlns:am3d="http://schemas.microsoft.com/office/drawing/2017/model3d" xmlns:o="urn:schemas-microsoft-com:office:office" xmlns:r="http://schemas.openxmlformats.org/officeDocument/2006/relationships" xmlns:m="http://schemas.openxmlformats.org/officeDocument/2006/math" xmlns:v="urn:schemas-microsoft-com:vml" xmlns:wp14="http://schemas.microsoft.com/office/word/2010/wordprocessingDrawing" xmlns:wp="http://schemas.openxmlformats.org/drawingml/2006/wordprocessingDrawing" xmlns:w10="urn:schemas-microsoft-com:office:word" xmlns:w="http://schemas.openxmlformats.org/wordprocessingml/2006/main" xmlns:w14="http://schemas.microsoft.com/office/word/2010/wordml" xmlns:w15="http://schemas.microsoft.com/office/word/2012/wordml" xmlns:w16cex="http://schemas.microsoft.com/office/word/2018/wordml/cex" xmlns:w16cid="http://schemas.microsoft.com/office/word/2016/wordml/cid" xmlns:w16="http://schemas.microsoft.com/office/word/2018/wordml" xmlns:w16se="http://schemas.microsoft.com/office/word/2015/wordml/symex" xmlns:wpg="http://schemas.microsoft.com/office/word/2010/wordprocessingGroup" xmlns:wpi="http://schemas.microsoft.com/office/word/2010/wordprocessingInk" xmlns:wne="http://schemas.microsoft.com/office/word/2006/wordml" xmlns:wps="http://schemas.microsoft.com/office/word/2010/wordprocessingShape" mc:Ignorable="w14 w15 w16se w16cid w16 w16cex wp14">
   <w:abstractNum w:abstractNumId="0" w15:restartNumberingAfterBreak="0">
-    <w:nsid w:val="1D17434E"/>
+    <w:nsid w:val="0E580002"/>
     <w:multiLevelType w:val="hybridMultilevel"/>
-    <w:tmpl w:val="A088010A"/>
-    <w:lvl w:ilvl="0" w:tplc="4DB472C8">
+    <w:tmpl w:val="DB3AC524"/>
+    <w:lvl w:ilvl="0" w:tplc="6B6C74F2">
+      <w:start w:val="1"/>
+      <w:numFmt w:val="bullet"/>
+      <w:lvlText w:val="●"/>
+      <w:lvlJc w:val="left"/>
+      <w:pPr>
+        <w:ind w:left="720" w:hanging="360"/>
+      </w:pPr>
+    </w:lvl>
+    <w:lvl w:ilvl="1" w:tplc="DE3E6BAE">
+      <w:start w:val="1"/>
+      <w:numFmt w:val="bullet"/>
+      <w:lvlText w:val="○"/>
+      <w:lvlJc w:val="left"/>
+      <w:pPr>
+        <w:ind w:left="1440" w:hanging="360"/>
+      </w:pPr>
+    </w:lvl>
+    <w:lvl w:ilvl="2" w:tplc="5A5281BC">
+      <w:start w:val="1"/>
+      <w:numFmt w:val="bullet"/>
+      <w:lvlText w:val="■"/>
+      <w:lvlJc w:val="left"/>
+      <w:pPr>
+        <w:ind w:left="2160" w:hanging="360"/>
+      </w:pPr>
+    </w:lvl>
+    <w:lvl w:ilvl="3" w:tplc="9D0A0852">
+      <w:start w:val="1"/>
+      <w:numFmt w:val="bullet"/>
+      <w:lvlText w:val="●"/>
+      <w:lvlJc w:val="left"/>
+      <w:pPr>
+        <w:ind w:left="2880" w:hanging="360"/>
+      </w:pPr>
+    </w:lvl>
+    <w:lvl w:ilvl="4" w:tplc="88B278CA">
+      <w:start w:val="1"/>
+      <w:numFmt w:val="bullet"/>
+      <w:lvlText w:val="○"/>
+      <w:lvlJc w:val="left"/>
+      <w:pPr>
+        <w:ind w:left="3600" w:hanging="360"/>
+      </w:pPr>
+    </w:lvl>
+    <w:lvl w:ilvl="5" w:tplc="69A65EC8">
+      <w:start w:val="1"/>
+      <w:numFmt w:val="bullet"/>
+      <w:lvlText w:val="■"/>
+      <w:lvlJc w:val="left"/>
+      <w:pPr>
+        <w:ind w:left="4320" w:hanging="360"/>
+      </w:pPr>
+    </w:lvl>
+    <w:lvl w:ilvl="6" w:tplc="8014EB90">
+      <w:start w:val="1"/>
+      <w:numFmt w:val="bullet"/>
+      <w:lvlText w:val="●"/>
+      <w:lvlJc w:val="left"/>
+      <w:pPr>
+        <w:ind w:left="5040" w:hanging="360"/>
+      </w:pPr>
+    </w:lvl>
+    <w:lvl w:ilvl="7" w:tplc="8946E03C">
+      <w:start w:val="1"/>
+      <w:numFmt w:val="bullet"/>
+      <w:lvlText w:val="●"/>
+      <w:lvlJc w:val="left"/>
+      <w:pPr>
+        <w:ind w:left="5760" w:hanging="360"/>
+      </w:pPr>
+    </w:lvl>
+    <w:lvl w:ilvl="8" w:tplc="0C2A1A64">
+      <w:start w:val="1"/>
+      <w:numFmt w:val="bullet"/>
+      <w:lvlText w:val="●"/>
+      <w:lvlJc w:val="left"/>
+      <w:pPr>
+        <w:ind w:left="6480" w:hanging="360"/>
+      </w:pPr>
+    </w:lvl>
+  </w:abstractNum>
+  <w:abstractNum w:abstractNumId="1" w15:restartNumberingAfterBreak="0">
+    <w:nsid w:val="6AE06908"/>
+    <w:multiLevelType w:val="hybridMultilevel"/>
+    <w:tmpl w:val="2A66D1A2"/>
+    <w:lvl w:ilvl="0" w:tplc="B050856E">
       <w:start w:val="1"/>
       <w:numFmt w:val="bullet"/>
       <w:lvlText w:val="•"/>
@@ -3435,7 +3630,7 @@
         <w:ind w:left="316" w:hanging="215"/>
       </w:pPr>
     </w:lvl>
-    <w:lvl w:ilvl="1" w:tplc="BF6C0598">
+    <w:lvl w:ilvl="1" w:tplc="3034C976">
       <w:start w:val="1"/>
       <w:numFmt w:val="bullet"/>
       <w:lvlText w:val="–"/>
@@ -3444,136 +3639,50 @@
         <w:ind w:left="648" w:hanging="215"/>
       </w:pPr>
     </w:lvl>
-    <w:lvl w:ilvl="2" w:tplc="05A86AE2">
+    <w:lvl w:ilvl="2" w:tplc="3C305764">
       <w:numFmt w:val="decimal"/>
       <w:lvlText w:val=""/>
       <w:lvlJc w:val="left"/>
     </w:lvl>
-    <w:lvl w:ilvl="3" w:tplc="EEE8E7D4">
+    <w:lvl w:ilvl="3" w:tplc="EE889F50">
       <w:numFmt w:val="decimal"/>
       <w:lvlText w:val=""/>
       <w:lvlJc w:val="left"/>
     </w:lvl>
-    <w:lvl w:ilvl="4" w:tplc="3FE49868">
+    <w:lvl w:ilvl="4" w:tplc="4600EC4E">
       <w:numFmt w:val="decimal"/>
       <w:lvlText w:val=""/>
       <w:lvlJc w:val="left"/>
     </w:lvl>
-    <w:lvl w:ilvl="5" w:tplc="547A4496">
+    <w:lvl w:ilvl="5" w:tplc="18C46E14">
       <w:numFmt w:val="decimal"/>
       <w:lvlText w:val=""/>
       <w:lvlJc w:val="left"/>
     </w:lvl>
-    <w:lvl w:ilvl="6" w:tplc="950EC224">
+    <w:lvl w:ilvl="6" w:tplc="877C0EF0">
       <w:numFmt w:val="decimal"/>
       <w:lvlText w:val=""/>
       <w:lvlJc w:val="left"/>
     </w:lvl>
-    <w:lvl w:ilvl="7" w:tplc="655E3FD8">
+    <w:lvl w:ilvl="7" w:tplc="699C07C8">
       <w:numFmt w:val="decimal"/>
       <w:lvlText w:val=""/>
       <w:lvlJc w:val="left"/>
     </w:lvl>
-    <w:lvl w:ilvl="8" w:tplc="BA9A39B4">
+    <w:lvl w:ilvl="8" w:tplc="081461D6">
       <w:numFmt w:val="decimal"/>
       <w:lvlText w:val=""/>
       <w:lvlJc w:val="left"/>
     </w:lvl>
   </w:abstractNum>
-  <w:abstractNum w:abstractNumId="1" w15:restartNumberingAfterBreak="0">
-    <w:nsid w:val="25986226"/>
-    <w:multiLevelType w:val="hybridMultilevel"/>
-    <w:tmpl w:val="203CFF42"/>
-    <w:lvl w:ilvl="0" w:tplc="190E6F4A">
-      <w:start w:val="1"/>
-      <w:numFmt w:val="bullet"/>
-      <w:lvlText w:val="●"/>
-      <w:lvlJc w:val="left"/>
-      <w:pPr>
-        <w:ind w:left="720" w:hanging="360"/>
-      </w:pPr>
-    </w:lvl>
-    <w:lvl w:ilvl="1" w:tplc="FD9CE8AA">
-      <w:start w:val="1"/>
-      <w:numFmt w:val="bullet"/>
-      <w:lvlText w:val="○"/>
-      <w:lvlJc w:val="left"/>
-      <w:pPr>
-        <w:ind w:left="1440" w:hanging="360"/>
-      </w:pPr>
-    </w:lvl>
-    <w:lvl w:ilvl="2" w:tplc="48706706">
-      <w:start w:val="1"/>
-      <w:numFmt w:val="bullet"/>
-      <w:lvlText w:val="■"/>
-      <w:lvlJc w:val="left"/>
-      <w:pPr>
-        <w:ind w:left="2160" w:hanging="360"/>
-      </w:pPr>
-    </w:lvl>
-    <w:lvl w:ilvl="3" w:tplc="D42E6B7C">
-      <w:start w:val="1"/>
-      <w:numFmt w:val="bullet"/>
-      <w:lvlText w:val="●"/>
-      <w:lvlJc w:val="left"/>
-      <w:pPr>
-        <w:ind w:left="2880" w:hanging="360"/>
-      </w:pPr>
-    </w:lvl>
-    <w:lvl w:ilvl="4" w:tplc="E6D63BD8">
-      <w:start w:val="1"/>
-      <w:numFmt w:val="bullet"/>
-      <w:lvlText w:val="○"/>
-      <w:lvlJc w:val="left"/>
-      <w:pPr>
-        <w:ind w:left="3600" w:hanging="360"/>
-      </w:pPr>
-    </w:lvl>
-    <w:lvl w:ilvl="5" w:tplc="2326F00E">
-      <w:start w:val="1"/>
-      <w:numFmt w:val="bullet"/>
-      <w:lvlText w:val="■"/>
-      <w:lvlJc w:val="left"/>
-      <w:pPr>
-        <w:ind w:left="4320" w:hanging="360"/>
-      </w:pPr>
-    </w:lvl>
-    <w:lvl w:ilvl="6" w:tplc="F72E65AA">
-      <w:start w:val="1"/>
-      <w:numFmt w:val="bullet"/>
-      <w:lvlText w:val="●"/>
-      <w:lvlJc w:val="left"/>
-      <w:pPr>
-        <w:ind w:left="5040" w:hanging="360"/>
-      </w:pPr>
-    </w:lvl>
-    <w:lvl w:ilvl="7" w:tplc="9F62F1F2">
-      <w:start w:val="1"/>
-      <w:numFmt w:val="bullet"/>
-      <w:lvlText w:val="●"/>
-      <w:lvlJc w:val="left"/>
-      <w:pPr>
-        <w:ind w:left="5760" w:hanging="360"/>
-      </w:pPr>
-    </w:lvl>
-    <w:lvl w:ilvl="8" w:tplc="92FE941A">
-      <w:start w:val="1"/>
-      <w:numFmt w:val="bullet"/>
-      <w:lvlText w:val="●"/>
-      <w:lvlJc w:val="left"/>
-      <w:pPr>
-        <w:ind w:left="6480" w:hanging="360"/>
-      </w:pPr>
-    </w:lvl>
-  </w:abstractNum>
   <w:num w:numId="1">
-    <w:abstractNumId w:val="1"/>
+    <w:abstractNumId w:val="0"/>
     <w:lvlOverride w:ilvl="0">
       <w:startOverride w:val="1"/>
     </w:lvlOverride>
   </w:num>
   <w:num w:numId="2">
-    <w:abstractNumId w:val="0"/>
+    <w:abstractNumId w:val="1"/>
     <w:lvlOverride w:ilvl="0">
       <w:startOverride w:val="1"/>
     </w:lvlOverride>

</xml_diff>

<commit_message>
Add S POS flagship project across portfolio, resumes and profile README
- New s-pos flagship entry in projects.json with screenshots (POS + dashboard)
- Eight flagship systems: home heading, assistant counts, profile README intro
- S POS block inserted into all four resume masters (docx XML surgery) and all
  region variants + master PDFs regenerated with it

Co-Authored-By: Claude Fable 5 <noreply@anthropic.com>
Claude-Session: https://claude.ai/code/session_014wrFbt9XkBqDpH7nqL94UT
</commit_message>
<xml_diff>
--- a/public/resume/Sridhar_Mahalingam_Software_Developer_Australia.docx
+++ b/public/resume/Sridhar_Mahalingam_Software_Developer_Australia.docx
@@ -8,7 +8,6 @@
         <w:jc w:val="center"/>
       </w:pPr>
       <w:bookmarkStart w:id="0" w:name="_GoBack"/>
-      <w:bookmarkEnd w:id="0"/>
       <w:r>
         <w:rPr>
           <w:b/>
@@ -1944,7 +1943,7 @@
           <w:bCs/>
           <w:color w:val="10314F"/>
         </w:rPr>
-        <w:t>AI Research Agent — Multi-Agent Research System with Verifie</w:t>
+        <w:t>S POS — Multi-Platform Retail Point of Sale (Web, Desktop, M</w:t>
       </w:r>
       <w:r>
         <w:rPr>
@@ -1952,7 +1951,7 @@
           <w:bCs/>
           <w:color w:val="10314F"/>
         </w:rPr>
-        <w:t>d Citations</w:t>
+        <w:t>obile)</w:t>
       </w:r>
       <w:r>
         <w:rPr>
@@ -1962,7 +1961,7 @@
           <w:sz w:val="18"/>
           <w:szCs w:val="18"/>
         </w:rPr>
-        <w:t xml:space="preserve">  ·  Independent project · sole architect &amp; developer</w:t>
+        <w:t xml:space="preserve">  ·  Independent product · sole architect &amp; developer</w:t>
       </w:r>
     </w:p>
     <w:p>
@@ -1977,85 +1976,85 @@
           <w:sz w:val="17"/>
           <w:szCs w:val="17"/>
         </w:rPr>
-        <w:t>Stack: Python · LangGraph · FastAPI · Ollama (local LLM) · PostgreSQL + pgvector · FAISS · sentence-transformers · Next.js 16 · TypeScript</w:t>
-      </w:r>
-    </w:p>
-    <w:p>
-      <w:pPr>
-        <w:pStyle w:val="ListParagraph"/>
-        <w:numPr>
-          <w:ilvl w:val="0"/>
-          <w:numId w:val="2"/>
-        </w:numPr>
-        <w:spacing w:after="40" w:line="250" w:lineRule="auto"/>
-      </w:pPr>
-      <w:r>
-        <w:rPr>
-          <w:color w:val="1A1A1A"/>
-        </w:rPr>
-        <w:t>Built a multi-agent research system on a LangGraph s</w:t>
-      </w:r>
-      <w:r>
-        <w:rPr>
-          <w:color w:val="1A1A1A"/>
-        </w:rPr>
-        <w:t xml:space="preserve">tate machine — Planner, Researcher, Analyst, Critic, Writer and Citation-Verifier agents that search the real web, build a per-session RAG index with full provenance, and generate findings grounded only in retrieved evidence — all running on a fully local </w:t>
-      </w:r>
-      <w:r>
-        <w:rPr>
-          <w:color w:val="1A1A1A"/>
-        </w:rPr>
-        <w:t>LLM (Ollama) with local embeddings and no cloud AI.</w:t>
-      </w:r>
-    </w:p>
-    <w:p>
-      <w:pPr>
-        <w:pStyle w:val="ListParagraph"/>
-        <w:numPr>
-          <w:ilvl w:val="0"/>
-          <w:numId w:val="2"/>
-        </w:numPr>
-        <w:spacing w:after="40" w:line="250" w:lineRule="auto"/>
-      </w:pPr>
-      <w:r>
-        <w:rPr>
-          <w:color w:val="1A1A1A"/>
-        </w:rPr>
-        <w:t>Engineered hallucination reduction as architecture rather than prompting — findings citing pages never fetched are discarded deterministically, a Critic gate loops the workflow back to research when evide</w:t>
-      </w:r>
-      <w:r>
-        <w:rPr>
-          <w:color w:val="1A1A1A"/>
-        </w:rPr>
-        <w:t>nce is insufficient (hard-capped at two iterations), and every citation in the final report is semantically verified against the session's own sources; measured citation coverage rose from 0% to 60–86%.</w:t>
-      </w:r>
-    </w:p>
-    <w:p>
-      <w:pPr>
-        <w:pStyle w:val="ListParagraph"/>
-        <w:numPr>
-          <w:ilvl w:val="0"/>
-          <w:numId w:val="2"/>
-        </w:numPr>
-        <w:spacing w:after="40" w:line="250" w:lineRule="auto"/>
-      </w:pPr>
-      <w:r>
-        <w:rPr>
-          <w:color w:val="1A1A1A"/>
-        </w:rPr>
-        <w:t>Delivered a FastAPI + Next.js research workstation st</w:t>
-      </w:r>
-      <w:r>
-        <w:rPr>
-          <w:color w:val="1A1A1A"/>
-        </w:rPr>
-        <w:t>reaming live agent progress over Server-Sent Events, with hybrid retrieval (dense embeddings fused with BM25 via reciprocal rank fusion), schema-constrained JSON decoding, provider-fallback web search and a built-in evaluation harness benchmarking citation</w:t>
-      </w:r>
-      <w:r>
-        <w:rPr>
-          <w:color w:val="1A1A1A"/>
-        </w:rPr>
-        <w:t xml:space="preserve"> coverage, groundedness and latency across local models — 38 tests, all external services mocked.</w:t>
+        <w:t>Stack: Python · Django 5.2 · Django REST Framework · React 19 · React Native (Expo) · PostgreSQL · SQLite · Redis · Celery · PyInstaller · Docker · Nginx</w:t>
+      </w:r>
+    </w:p>
+    <w:p>
+      <w:pPr>
+        <w:pStyle w:val="ListParagraph"/>
+        <w:numPr>
+          <w:ilvl w:val="0"/>
+          <w:numId w:val="2"/>
+        </w:numPr>
+        <w:spacing w:after="40" w:line="250" w:lineRule="auto"/>
+      </w:pPr>
+      <w:r>
+        <w:rPr>
+          <w:color w:val="1A1A1A"/>
+        </w:rPr>
+        <w:t>Built a complete, multi-currency retail po</w:t>
+      </w:r>
+      <w:r>
+        <w:rPr>
+          <w:color w:val="1A1A1A"/>
+        </w:rPr>
+        <w:t>int-of-sale and back-office platform that runs three ways from one Django 5.2 + DRF backend — a hosted multi-store SaaS (Docker, PostgreSQL, Redis, Nginx/TLS), a self-contained Windows desktop exe (PyInstaller + SQLite) that serves every till, tablet and p</w:t>
+      </w:r>
+      <w:r>
+        <w:rPr>
+          <w:color w:val="1A1A1A"/>
+        </w:rPr>
+        <w:t>hone on the shop Wi-Fi, and an Expo/React Native mobile app that can run the entire store on a phone, fully offline.</w:t>
+      </w:r>
+    </w:p>
+    <w:p>
+      <w:pPr>
+        <w:pStyle w:val="ListParagraph"/>
+        <w:numPr>
+          <w:ilvl w:val="0"/>
+          <w:numId w:val="2"/>
+        </w:numPr>
+        <w:spacing w:after="40" w:line="250" w:lineRule="auto"/>
+      </w:pPr>
+      <w:r>
+        <w:rPr>
+          <w:color w:val="1A1A1A"/>
+        </w:rPr>
+        <w:t>Engineered server-authoritative money paths — checkout recomputes every invoice with identical per-line rounding, tax and discount rules an</w:t>
+      </w:r>
+      <w:r>
+        <w:rPr>
+          <w:color w:val="1A1A1A"/>
+        </w:rPr>
+        <w:t>d rejects mismatches; sale creation, row-locked stock decrement, per-item COGS capture and double-entry ledger posting share one database transaction, keyed by an idempotency key so the same key can never produce a duplicate charge.</w:t>
+      </w:r>
+    </w:p>
+    <w:p>
+      <w:pPr>
+        <w:pStyle w:val="ListParagraph"/>
+        <w:numPr>
+          <w:ilvl w:val="0"/>
+          <w:numId w:val="2"/>
+        </w:numPr>
+        <w:spacing w:after="40" w:line="250" w:lineRule="auto"/>
+      </w:pPr>
+      <w:r>
+        <w:rPr>
+          <w:color w:val="1A1A1A"/>
+        </w:rPr>
+        <w:t>Shipped full retail ope</w:t>
+      </w:r>
+      <w:r>
+        <w:rPr>
+          <w:color w:val="1A1A1A"/>
+        </w:rPr>
+        <w:t>rations across all three clients — split-tender payments, void/refund with inventory and ledger reversal, register open/close with X/Z reports and drawer reconciliation, product variants and modifiers, server-side promotions and price lists, gift cards and</w:t>
+      </w:r>
+      <w:r>
+        <w:rPr>
+          <w:color w:val="1A1A1A"/>
+        </w:rPr>
+        <w:t xml:space="preserve"> store credit with server-enforced balances, purchasing with partial receiving, inter-store transfers and HMAC-SHA256-signed payment webhooks.</w:t>
       </w:r>
     </w:p>
     <w:p>
@@ -2068,7 +2067,7 @@
           <w:bCs/>
           <w:color w:val="10314F"/>
         </w:rPr>
-        <w:t>TrafficVision — AI Traffic Intelligence Platform</w:t>
+        <w:t>AI Research Agent — Multi-Agent Research System with Verified Citations</w:t>
       </w:r>
       <w:r>
         <w:rPr>
@@ -2078,117 +2077,7 @@
           <w:sz w:val="18"/>
           <w:szCs w:val="18"/>
         </w:rPr>
-        <w:t xml:space="preserve">  ·  Independent research · sole architect &amp; developer · model in training</w:t>
-      </w:r>
-    </w:p>
-    <w:p>
-      <w:pPr>
-        <w:spacing w:after="50" w:line="250" w:lineRule="auto"/>
-      </w:pPr>
-      <w:r>
-        <w:rPr>
-          <w:b/>
-          <w:bCs/>
-          <w:color w:val="1B6E8C"/>
-          <w:sz w:val="17"/>
-          <w:szCs w:val="17"/>
-        </w:rPr>
-        <w:t xml:space="preserve">Stack: </w:t>
-      </w:r>
-      <w:r>
-        <w:rPr>
-          <w:color w:val="4A4A4A"/>
-          <w:sz w:val="17"/>
-          <w:szCs w:val="17"/>
-        </w:rPr>
-        <w:t>Python · PyTorch · FCOS / ON</w:t>
-      </w:r>
-      <w:r>
-        <w:rPr>
-          <w:color w:val="4A4A4A"/>
-          <w:sz w:val="17"/>
-          <w:szCs w:val="17"/>
-        </w:rPr>
-        <w:t>NX Runtime · Django REST Framework · Celery · Redis · PostgreSQL · Next.js</w:t>
-      </w:r>
-    </w:p>
-    <w:p>
-      <w:pPr>
-        <w:pStyle w:val="ListParagraph"/>
-        <w:numPr>
-          <w:ilvl w:val="0"/>
-          <w:numId w:val="2"/>
-        </w:numPr>
-        <w:spacing w:after="40" w:line="250" w:lineRule="auto"/>
-      </w:pPr>
-      <w:r>
-        <w:rPr>
-          <w:color w:val="1A1A1A"/>
-        </w:rPr>
-        <w:t xml:space="preserve">Built a computer-vision platform that ingests traffic video and turns it into structured, real-time intelligence about vehicles and road conditions — modelling the full domain from </w:t>
-      </w:r>
-      <w:r>
-        <w:rPr>
-          <w:color w:val="1A1A1A"/>
-        </w:rPr>
-        <w:t>city down to individual lanes, cameras, regions-of-interest and counting lines, so every detection carries real spatial meaning rather than raw pixel boxes.</w:t>
-      </w:r>
-    </w:p>
-    <w:p>
-      <w:pPr>
-        <w:pStyle w:val="ListParagraph"/>
-        <w:numPr>
-          <w:ilvl w:val="0"/>
-          <w:numId w:val="2"/>
-        </w:numPr>
-        <w:spacing w:after="40" w:line="250" w:lineRule="auto"/>
-      </w:pPr>
-      <w:r>
-        <w:rPr>
-          <w:color w:val="1A1A1A"/>
-        </w:rPr>
-        <w:t>Trained an FCOS vehicle detector exported to ONNX for fast inference, with train-equals-serve prepr</w:t>
-      </w:r>
-      <w:r>
-        <w:rPr>
-          <w:color w:val="1A1A1A"/>
-        </w:rPr>
-        <w:t>ocessing; owns the full pipeline — dataset preparation, leakage-safe splits, multi-day interruptible training with checkpoint and resume, and honest evaluation (IoU precision/recall, mAP) on held-out data.</w:t>
-      </w:r>
-    </w:p>
-    <w:p>
-      <w:pPr>
-        <w:pStyle w:val="ListParagraph"/>
-        <w:numPr>
-          <w:ilvl w:val="0"/>
-          <w:numId w:val="2"/>
-        </w:numPr>
-        <w:spacing w:after="40" w:line="250" w:lineRule="auto"/>
-      </w:pPr>
-      <w:r>
-        <w:rPr>
-          <w:color w:val="1A1A1A"/>
-        </w:rPr>
-        <w:t>Engineered GPU-managed processing sessions on Cele</w:t>
-      </w:r>
-      <w:r>
-        <w:rPr>
-          <w:color w:val="1A1A1A"/>
-        </w:rPr>
-        <w:t>ry that run video through the model off the request path, with GPU allocation, heartbeats and automatic crash recovery, so long-running analysis never blocks the API.</w:t>
-      </w:r>
-    </w:p>
-    <w:p>
-      <w:pPr>
-        <w:spacing w:before="120" w:after="30"/>
-      </w:pPr>
-      <w:r>
-        <w:rPr>
-          <w:b/>
-          <w:bCs/>
-          <w:color w:val="10314F"/>
-        </w:rPr>
-        <w:t>CommerceOS — Business-Agnostic Commerce Platform</w:t>
+        <w:t xml:space="preserve">  ·  Independent project · sole architect </w:t>
       </w:r>
       <w:r>
         <w:rPr>
@@ -2198,7 +2087,114 @@
           <w:sz w:val="18"/>
           <w:szCs w:val="18"/>
         </w:rPr>
-        <w:t xml:space="preserve">  ·  Independent project · sole architect</w:t>
+        <w:t>&amp; developer</w:t>
+      </w:r>
+    </w:p>
+    <w:p>
+      <w:pPr>
+        <w:spacing w:after="50" w:line="250" w:lineRule="auto"/>
+      </w:pPr>
+      <w:r>
+        <w:rPr>
+          <w:b/>
+          <w:bCs/>
+          <w:color w:val="1B6E8C"/>
+          <w:sz w:val="17"/>
+          <w:szCs w:val="17"/>
+        </w:rPr>
+        <w:t>Stack: Python · LangGraph · FastAPI · Ollama (local LLM) · PostgreSQL + pgvector · FAISS · sentence-transformers · Next.js 16 · TypeScript</w:t>
+      </w:r>
+    </w:p>
+    <w:p>
+      <w:pPr>
+        <w:pStyle w:val="ListParagraph"/>
+        <w:numPr>
+          <w:ilvl w:val="0"/>
+          <w:numId w:val="2"/>
+        </w:numPr>
+        <w:spacing w:after="40" w:line="250" w:lineRule="auto"/>
+      </w:pPr>
+      <w:r>
+        <w:rPr>
+          <w:color w:val="1A1A1A"/>
+        </w:rPr>
+        <w:t xml:space="preserve">Built a multi-agent research system on a LangGraph state machine — Planner, Researcher, Analyst, Critic, </w:t>
+      </w:r>
+      <w:r>
+        <w:rPr>
+          <w:color w:val="1A1A1A"/>
+        </w:rPr>
+        <w:t>Writer and Citation-Verifier agents that search the real web, build a per-session RAG index with full provenance, and generate findings grounded only in retrieved evidence — all running on a fully local LLM (Ollama) with local embeddings and no cloud AI.</w:t>
+      </w:r>
+    </w:p>
+    <w:p>
+      <w:pPr>
+        <w:pStyle w:val="ListParagraph"/>
+        <w:numPr>
+          <w:ilvl w:val="0"/>
+          <w:numId w:val="2"/>
+        </w:numPr>
+        <w:spacing w:after="40" w:line="250" w:lineRule="auto"/>
+      </w:pPr>
+      <w:r>
+        <w:rPr>
+          <w:color w:val="1A1A1A"/>
+        </w:rPr>
+        <w:lastRenderedPageBreak/>
+        <w:t>E</w:t>
+      </w:r>
+      <w:r>
+        <w:rPr>
+          <w:color w:val="1A1A1A"/>
+        </w:rPr>
+        <w:t xml:space="preserve">ngineered hallucination reduction as architecture rather than prompting — findings citing pages never fetched are discarded deterministically, a Critic gate loops the workflow back to research when evidence is insufficient (hard-capped at two iterations), </w:t>
+      </w:r>
+      <w:r>
+        <w:rPr>
+          <w:color w:val="1A1A1A"/>
+        </w:rPr>
+        <w:t>and every citation in the final report is semantically verified against the session's own sources; measured citation coverage rose from 0% to 60–86%.</w:t>
+      </w:r>
+    </w:p>
+    <w:p>
+      <w:pPr>
+        <w:pStyle w:val="ListParagraph"/>
+        <w:numPr>
+          <w:ilvl w:val="0"/>
+          <w:numId w:val="2"/>
+        </w:numPr>
+        <w:spacing w:after="40" w:line="250" w:lineRule="auto"/>
+      </w:pPr>
+      <w:r>
+        <w:rPr>
+          <w:color w:val="1A1A1A"/>
+        </w:rPr>
+        <w:t xml:space="preserve">Delivered a FastAPI + Next.js research workstation streaming live agent progress over Server-Sent Events, </w:t>
+      </w:r>
+      <w:r>
+        <w:rPr>
+          <w:color w:val="1A1A1A"/>
+        </w:rPr>
+        <w:t>with hybrid retrieval (dense embeddings fused with BM25 via reciprocal rank fusion), schema-constrained JSON decoding, provider-fallback web search and a built-in evaluation harness benchmarking citation coverage, groundedness and latency across local mode</w:t>
+      </w:r>
+      <w:r>
+        <w:rPr>
+          <w:color w:val="1A1A1A"/>
+        </w:rPr>
+        <w:t>ls — 38 tests, all external services mocked.</w:t>
+      </w:r>
+    </w:p>
+    <w:p>
+      <w:pPr>
+        <w:spacing w:before="120" w:after="30"/>
+      </w:pPr>
+      <w:r>
+        <w:rPr>
+          <w:b/>
+          <w:bCs/>
+          <w:color w:val="10314F"/>
+        </w:rPr>
+        <w:t>TrafficVision — AI Traffic Intelligence Platform</w:t>
       </w:r>
       <w:r>
         <w:rPr>
@@ -2208,7 +2204,7 @@
           <w:sz w:val="18"/>
           <w:szCs w:val="18"/>
         </w:rPr>
-        <w:t xml:space="preserve"> &amp; developer</w:t>
+        <w:t xml:space="preserve">  ·  Independent research · sole architect &amp; developer · model in training</w:t>
       </w:r>
     </w:p>
     <w:p>
@@ -2231,79 +2227,75 @@
           <w:sz w:val="17"/>
           <w:szCs w:val="17"/>
         </w:rPr>
-        <w:t>Python 3.12 · Django 5.2 · DRF · Django Channels · Celery · Redis · PostgreSQL · Next.js 15 · TypeScript · TanStack Query · Docker</w:t>
-      </w:r>
-    </w:p>
-    <w:p>
-      <w:pPr>
-        <w:pStyle w:val="ListParagraph"/>
-        <w:numPr>
-          <w:ilvl w:val="0"/>
-          <w:numId w:val="2"/>
-        </w:numPr>
-        <w:spacing w:after="40" w:line="250" w:lineRule="auto"/>
-      </w:pPr>
-      <w:r>
-        <w:rPr>
-          <w:color w:val="1A1A1A"/>
-        </w:rPr>
-        <w:t>Built a multi-tenant, headless commerce platform whose backend is deliberately vertical-neutral — the sam</w:t>
-      </w:r>
-      <w:r>
-        <w:rPr>
-          <w:color w:val="1A1A1A"/>
-        </w:rPr>
-        <w:t>e engine powers a boutique, grocery, pharmacy or B2B wholesaler, with each store’s identity expressed as configuration rather than hardcoded logic and no business-type conditional anywhere in the backend.</w:t>
-      </w:r>
-    </w:p>
-    <w:p>
-      <w:pPr>
-        <w:pStyle w:val="ListParagraph"/>
-        <w:numPr>
-          <w:ilvl w:val="0"/>
-          <w:numId w:val="2"/>
-        </w:numPr>
-        <w:spacing w:after="40" w:line="250" w:lineRule="auto"/>
-      </w:pPr>
-      <w:r>
-        <w:rPr>
-          <w:color w:val="1A1A1A"/>
-        </w:rPr>
-        <w:t xml:space="preserve">Designed the catalogue engine end to end (tenant → </w:t>
-      </w:r>
-      <w:r>
-        <w:rPr>
-          <w:color w:val="1A1A1A"/>
-        </w:rPr>
-        <w:t>catalogue → category → product → variant) with a full variant engine, dynamic attributes, brands, collections and SEO/JSON-LD generation, plus a global-market pricing engine modelling market as distinct from currency with locked prices, FX fallback and a d</w:t>
-      </w:r>
-      <w:r>
-        <w:rPr>
-          <w:color w:val="1A1A1A"/>
-        </w:rPr>
-        <w:t>eterministic no-borrowing resolver.</w:t>
-      </w:r>
-    </w:p>
-    <w:p>
-      <w:pPr>
-        <w:pStyle w:val="ListParagraph"/>
-        <w:numPr>
-          <w:ilvl w:val="0"/>
-          <w:numId w:val="2"/>
-        </w:numPr>
-        <w:spacing w:after="40" w:line="250" w:lineRule="auto"/>
-      </w:pPr>
-      <w:r>
-        <w:rPr>
-          <w:color w:val="1A1A1A"/>
-        </w:rPr>
-        <w:t>Applied ports and adapters from day one — payment, email, storage, search and notification each behind an abstract service with swappable adapters resolved per tenant — under Clean Architecture with CI-enforced dependency boundaries, strict mypy typing, UU</w:t>
-      </w:r>
-      <w:r>
-        <w:rPr>
-          <w:color w:val="1A1A1A"/>
-        </w:rPr>
-        <w:t>IDv7 keys and feature flags.</w:t>
+        <w:t>Python · PyTorch · FCOS / ONNX Runtime · Django REST Framework · Celery · Redis ·</w:t>
+      </w:r>
+      <w:r>
+        <w:rPr>
+          <w:color w:val="4A4A4A"/>
+          <w:sz w:val="17"/>
+          <w:szCs w:val="17"/>
+        </w:rPr>
+        <w:t xml:space="preserve"> PostgreSQL · Next.js</w:t>
+      </w:r>
+    </w:p>
+    <w:p>
+      <w:pPr>
+        <w:pStyle w:val="ListParagraph"/>
+        <w:numPr>
+          <w:ilvl w:val="0"/>
+          <w:numId w:val="2"/>
+        </w:numPr>
+        <w:spacing w:after="40" w:line="250" w:lineRule="auto"/>
+      </w:pPr>
+      <w:r>
+        <w:rPr>
+          <w:color w:val="1A1A1A"/>
+        </w:rPr>
+        <w:t>Built a computer-vision platform that ingests traffic video and turns it into structured, real-time intelligence about vehicles and road conditions — modelling the full domain from city down to individual lanes, cameras, regions-of-in</w:t>
+      </w:r>
+      <w:r>
+        <w:rPr>
+          <w:color w:val="1A1A1A"/>
+        </w:rPr>
+        <w:t>terest and counting lines, so every detection carries real spatial meaning rather than raw pixel boxes.</w:t>
+      </w:r>
+    </w:p>
+    <w:p>
+      <w:pPr>
+        <w:pStyle w:val="ListParagraph"/>
+        <w:numPr>
+          <w:ilvl w:val="0"/>
+          <w:numId w:val="2"/>
+        </w:numPr>
+        <w:spacing w:after="40" w:line="250" w:lineRule="auto"/>
+      </w:pPr>
+      <w:r>
+        <w:rPr>
+          <w:color w:val="1A1A1A"/>
+        </w:rPr>
+        <w:t>Trained an FCOS vehicle detector exported to ONNX for fast inference, with train-equals-serve preprocessing; owns the full pipeline — dataset preparatio</w:t>
+      </w:r>
+      <w:r>
+        <w:rPr>
+          <w:color w:val="1A1A1A"/>
+        </w:rPr>
+        <w:t>n, leakage-safe splits, multi-day interruptible training with checkpoint and resume, and honest evaluation (IoU precision/recall, mAP) on held-out data.</w:t>
+      </w:r>
+    </w:p>
+    <w:p>
+      <w:pPr>
+        <w:pStyle w:val="ListParagraph"/>
+        <w:numPr>
+          <w:ilvl w:val="0"/>
+          <w:numId w:val="2"/>
+        </w:numPr>
+        <w:spacing w:after="40" w:line="250" w:lineRule="auto"/>
+      </w:pPr>
+      <w:r>
+        <w:rPr>
+          <w:color w:val="1A1A1A"/>
+        </w:rPr>
+        <w:t>Engineered GPU-managed processing sessions on Celery that run video through the model off the request path, with GPU allocation, heartbeats and automatic crash recovery, so long-running analysis never blocks the API.</w:t>
       </w:r>
     </w:p>
     <w:p>
@@ -2316,7 +2308,15 @@
           <w:bCs/>
           <w:color w:val="10314F"/>
         </w:rPr>
-        <w:t>Airsume — Fully-Offline Resume Intelligence &amp; ATS Platform</w:t>
+        <w:t>CommerceOS — Business-Agnostic Commerce</w:t>
+      </w:r>
+      <w:r>
+        <w:rPr>
+          <w:b/>
+          <w:bCs/>
+          <w:color w:val="10314F"/>
+        </w:rPr>
+        <w:t xml:space="preserve"> Platform</w:t>
       </w:r>
       <w:r>
         <w:rPr>
@@ -2326,7 +2326,7 @@
           <w:sz w:val="18"/>
           <w:szCs w:val="18"/>
         </w:rPr>
-        <w:t xml:space="preserve">  ·  Independent research · sole architect &amp; developer</w:t>
+        <w:t xml:space="preserve">  ·  Independent project · sole architect &amp; developer</w:t>
       </w:r>
     </w:p>
     <w:p>
@@ -2349,81 +2349,79 @@
           <w:sz w:val="17"/>
           <w:szCs w:val="17"/>
         </w:rPr>
-        <w:t>Python · Django 5.2 · DRF · Celery · Redis · PostgreSQL · PyMuPDF / pdfplumber / python-docx · Tesseract OC</w:t>
-      </w:r>
-      <w:r>
-        <w:rPr>
-          <w:color w:val="4A4A4A"/>
-          <w:sz w:val="17"/>
-          <w:szCs w:val="17"/>
-        </w:rPr>
-        <w:t>R · RapidFuzz · Next.js 16 · React 19 · TypeScript</w:t>
-      </w:r>
-    </w:p>
-    <w:p>
-      <w:pPr>
-        <w:pStyle w:val="ListParagraph"/>
-        <w:numPr>
-          <w:ilvl w:val="0"/>
-          <w:numId w:val="2"/>
-        </w:numPr>
-        <w:spacing w:after="40" w:line="250" w:lineRule="auto"/>
-      </w:pPr>
-      <w:r>
-        <w:rPr>
-          <w:color w:val="1A1A1A"/>
-        </w:rPr>
-        <w:t>Built a resume and job-description analysis platform producing explainable hiring intelligence with no LLM or cloud AI — every parsed field and score traces back to the exact text and rule that produced it</w:t>
-      </w:r>
-      <w:r>
-        <w:rPr>
-          <w:color w:val="1A1A1A"/>
-        </w:rPr>
-        <w:t>, via a fully offline engine handling two-column layouts, tables and scanned PDFs through OCR.</w:t>
-      </w:r>
-    </w:p>
-    <w:p>
-      <w:pPr>
-        <w:pStyle w:val="ListParagraph"/>
-        <w:numPr>
-          <w:ilvl w:val="0"/>
-          <w:numId w:val="2"/>
-        </w:numPr>
-        <w:spacing w:after="40" w:line="250" w:lineRule="auto"/>
-      </w:pPr>
-      <w:r>
-        <w:rPr>
-          <w:color w:val="1A1A1A"/>
-        </w:rPr>
-        <w:t>Designed a versioned skill taxonomy of 432 skills across 33 categories and 10 industries with typed aliases and weighted relationships, matched by a staged offli</w:t>
-      </w:r>
-      <w:r>
-        <w:rPr>
-          <w:color w:val="1A1A1A"/>
-        </w:rPr>
-        <w:t>ne matcher (exact → alias → normalised → fuzzy, never fuzzy-first) that records how each match was made.</w:t>
-      </w:r>
-    </w:p>
-    <w:p>
-      <w:pPr>
-        <w:pStyle w:val="ListParagraph"/>
-        <w:numPr>
-          <w:ilvl w:val="0"/>
-          <w:numId w:val="2"/>
-        </w:numPr>
-        <w:spacing w:after="40" w:line="250" w:lineRule="auto"/>
-      </w:pPr>
-      <w:r>
-        <w:rPr>
-          <w:color w:val="1A1A1A"/>
-        </w:rPr>
-        <w:t xml:space="preserve">Engineered an explainable ATS scoring engine grading fit across six weighted categories with a neutralise-and-redistribute strategy for non-applicable </w:t>
-      </w:r>
-      <w:r>
-        <w:rPr>
-          <w:color w:val="1A1A1A"/>
-        </w:rPr>
-        <w:t>criteria and a reconciliation invariant, running asynchronously on Celery with live status polling and a golden-dataset benchmark harness keeping accuracy measurable.</w:t>
+        <w:t>Python 3.12 · Django 5.2 · DRF · Django Channels · Celery · Redis · PostgreSQL · Next.js 15 · TypeScript · TanStack Query · Docker</w:t>
+      </w:r>
+    </w:p>
+    <w:p>
+      <w:pPr>
+        <w:pStyle w:val="ListParagraph"/>
+        <w:numPr>
+          <w:ilvl w:val="0"/>
+          <w:numId w:val="2"/>
+        </w:numPr>
+        <w:spacing w:after="40" w:line="250" w:lineRule="auto"/>
+      </w:pPr>
+      <w:r>
+        <w:rPr>
+          <w:color w:val="1A1A1A"/>
+        </w:rPr>
+        <w:t xml:space="preserve">Built a multi-tenant, headless commerce platform whose </w:t>
+      </w:r>
+      <w:r>
+        <w:rPr>
+          <w:color w:val="1A1A1A"/>
+        </w:rPr>
+        <w:t>backend is deliberately vertical-neutral — the same engine powers a boutique, grocery, pharmacy or B2B wholesaler, with each store’s identity expressed as configuration rather than hardcoded logic and no business-type conditional anywhere in the backend.</w:t>
+      </w:r>
+    </w:p>
+    <w:p>
+      <w:pPr>
+        <w:pStyle w:val="ListParagraph"/>
+        <w:numPr>
+          <w:ilvl w:val="0"/>
+          <w:numId w:val="2"/>
+        </w:numPr>
+        <w:spacing w:after="40" w:line="250" w:lineRule="auto"/>
+      </w:pPr>
+      <w:r>
+        <w:rPr>
+          <w:color w:val="1A1A1A"/>
+        </w:rPr>
+        <w:t>D</w:t>
+      </w:r>
+      <w:r>
+        <w:rPr>
+          <w:color w:val="1A1A1A"/>
+        </w:rPr>
+        <w:t>esigned the catalogue engine end to end (tenant → catalogue → category → product → variant) with a full variant engine, dynamic attributes, brands, collections and SEO/JSON-LD generation, plus a global-market pricing engine modelling market as distinct fro</w:t>
+      </w:r>
+      <w:r>
+        <w:rPr>
+          <w:color w:val="1A1A1A"/>
+        </w:rPr>
+        <w:t>m currency with locked prices, FX fallback and a deterministic no-borrowing resolver.</w:t>
+      </w:r>
+    </w:p>
+    <w:p>
+      <w:pPr>
+        <w:pStyle w:val="ListParagraph"/>
+        <w:numPr>
+          <w:ilvl w:val="0"/>
+          <w:numId w:val="2"/>
+        </w:numPr>
+        <w:spacing w:after="40" w:line="250" w:lineRule="auto"/>
+      </w:pPr>
+      <w:r>
+        <w:rPr>
+          <w:color w:val="1A1A1A"/>
+        </w:rPr>
+        <w:t>Applied ports and adapters from day one — payment, email, storage, search and notification each behind an abstract service with swappable adapters resolved per tenant — u</w:t>
+      </w:r>
+      <w:r>
+        <w:rPr>
+          <w:color w:val="1A1A1A"/>
+        </w:rPr>
+        <w:t>nder Clean Architecture with CI-enforced dependency boundaries, strict mypy typing, UUIDv7 keys and feature flags.</w:t>
       </w:r>
     </w:p>
     <w:p>
@@ -2436,7 +2434,7 @@
           <w:bCs/>
           <w:color w:val="10314F"/>
         </w:rPr>
-        <w:t>MeetingMind AI — Fully-Offline Meeting Intelligence Platform</w:t>
+        <w:t>Airsume — Fully-Offline Resume Intelligence &amp; ATS Platform</w:t>
       </w:r>
       <w:r>
         <w:rPr>
@@ -2469,107 +2467,227 @@
           <w:sz w:val="17"/>
           <w:szCs w:val="17"/>
         </w:rPr>
-        <w:t>Python · Django 5 · DRF · Celery · Redis · PostgreSQL · Faster-Whisper · Ollama (Llama 3.2) · SpeechBrain ECAPA · FFmpeg · vector + full-text search · Next.js 16 · React 19 · TypeScript</w:t>
-      </w:r>
-    </w:p>
-    <w:p>
-      <w:pPr>
-        <w:pStyle w:val="ListParagraph"/>
-        <w:numPr>
-          <w:ilvl w:val="0"/>
-          <w:numId w:val="2"/>
-        </w:numPr>
-        <w:spacing w:after="40" w:line="250" w:lineRule="auto"/>
-      </w:pPr>
-      <w:r>
-        <w:rPr>
-          <w:color w:val="1A1A1A"/>
-        </w:rPr>
-        <w:t xml:space="preserve">Built a </w:t>
-      </w:r>
-      <w:r>
-        <w:rPr>
-          <w:color w:val="1A1A1A"/>
-        </w:rPr>
-        <w:t>meeting-assistant platform turning raw audio and video into transcripts, grounded summaries, tracked work and organisational knowledge — running entirely locally with no paid APIs, cloud AI or commercial SDKs, every AI capability behind a provider interfac</w:t>
-      </w:r>
-      <w:r>
-        <w:rPr>
-          <w:color w:val="1A1A1A"/>
-        </w:rPr>
-        <w:t>e defaulting to a local engine.</w:t>
-      </w:r>
-    </w:p>
-    <w:p>
-      <w:pPr>
-        <w:pStyle w:val="ListParagraph"/>
-        <w:numPr>
-          <w:ilvl w:val="0"/>
-          <w:numId w:val="2"/>
-        </w:numPr>
-        <w:spacing w:after="40" w:line="250" w:lineRule="auto"/>
-      </w:pPr>
-      <w:r>
-        <w:rPr>
-          <w:color w:val="1A1A1A"/>
-        </w:rPr>
-        <w:t>Engineered an asynchronous Celery pipeline (validate → extract → normalise → transcribe → diarise → summarise → index) with graceful degradation so a failed AI step never discards a good transcript, plus a reusable domain-ag</w:t>
-      </w:r>
-      <w:r>
-        <w:rPr>
-          <w:color w:val="1A1A1A"/>
-        </w:rPr>
-        <w:t>nostic job engine with dependency-graph ordering, exponential-backoff retry, idempotent resume and live progress.</w:t>
-      </w:r>
-    </w:p>
-    <w:p>
-      <w:pPr>
-        <w:pStyle w:val="ListParagraph"/>
-        <w:numPr>
-          <w:ilvl w:val="0"/>
-          <w:numId w:val="2"/>
-        </w:numPr>
-        <w:spacing w:after="40" w:line="250" w:lineRule="auto"/>
-      </w:pPr>
-      <w:r>
-        <w:rPr>
-          <w:color w:val="1A1A1A"/>
-        </w:rPr>
-        <w:t>Implemented grounded RAG chat over hybrid retrieval (local embeddings, Postgres full-text, recency) returning clickable-timestamp citations an</w:t>
-      </w:r>
-      <w:r>
-        <w:rPr>
-          <w:color w:val="1A1A1A"/>
-        </w:rPr>
-        <w:t>d refusing to answer beyond source material, and speaker diarisation via SpeechBrain ECAPA embeddings with a cross-meeting voice registry recognising recurring speakers through tiered similarity matching.</w:t>
-      </w:r>
-    </w:p>
-    <w:p>
-      <w:pPr>
-        <w:pStyle w:val="ListParagraph"/>
-        <w:numPr>
-          <w:ilvl w:val="0"/>
-          <w:numId w:val="2"/>
-        </w:numPr>
-        <w:spacing w:after="40" w:line="250" w:lineRule="auto"/>
-      </w:pPr>
-      <w:r>
-        <w:rPr>
-          <w:color w:val="1A1A1A"/>
-        </w:rPr>
-        <w:t xml:space="preserve">Designed a bitemporal, event-sourced knowledge hub </w:t>
-      </w:r>
-      <w:r>
-        <w:rPr>
-          <w:color w:val="1A1A1A"/>
-        </w:rPr>
-        <w:t>with time-travel queries, decision-evolution history and conflict detection, feeding an executive dashboard materialised incrementally rather than recomputed per request, alongside a 12-agent platform accessing data only through a permissioned tool registr</w:t>
-      </w:r>
-      <w:r>
-        <w:rPr>
-          <w:color w:val="1A1A1A"/>
-        </w:rPr>
-        <w:t>y with human approval gates.</w:t>
+        <w:t>Python · Django 5.2 · DRF · Celery · Redis · PostgreSQL · PyMuPDF / pdfplumber / python-docx · Tesseract OCR · RapidFuzz · Next.js 16 · React 19 · TypeScript</w:t>
+      </w:r>
+    </w:p>
+    <w:p>
+      <w:pPr>
+        <w:pStyle w:val="ListParagraph"/>
+        <w:numPr>
+          <w:ilvl w:val="0"/>
+          <w:numId w:val="2"/>
+        </w:numPr>
+        <w:spacing w:after="40" w:line="250" w:lineRule="auto"/>
+      </w:pPr>
+      <w:r>
+        <w:rPr>
+          <w:color w:val="1A1A1A"/>
+        </w:rPr>
+        <w:t>Built a resume and job-description analysis platform producing explainable hiring intelligence wit</w:t>
+      </w:r>
+      <w:r>
+        <w:rPr>
+          <w:color w:val="1A1A1A"/>
+        </w:rPr>
+        <w:t>h no LLM or cloud AI — every parsed field and score traces back to the exact text and rule that produced it, via a fully offline engine handling two-column layouts, tables and scanned PDFs through OCR.</w:t>
+      </w:r>
+    </w:p>
+    <w:p>
+      <w:pPr>
+        <w:pStyle w:val="ListParagraph"/>
+        <w:numPr>
+          <w:ilvl w:val="0"/>
+          <w:numId w:val="2"/>
+        </w:numPr>
+        <w:spacing w:after="40" w:line="250" w:lineRule="auto"/>
+      </w:pPr>
+      <w:r>
+        <w:rPr>
+          <w:color w:val="1A1A1A"/>
+        </w:rPr>
+        <w:t>Designed a versioned skill taxonomy of 432 skills acro</w:t>
+      </w:r>
+      <w:r>
+        <w:rPr>
+          <w:color w:val="1A1A1A"/>
+        </w:rPr>
+        <w:t>ss 33 categories and 10 industries with typed aliases and weighted relationships, matched by a staged offline matcher (exact → alias → normalised → fuzzy, never fuzzy-first) that records how each match was made.</w:t>
+      </w:r>
+    </w:p>
+    <w:p>
+      <w:pPr>
+        <w:pStyle w:val="ListParagraph"/>
+        <w:numPr>
+          <w:ilvl w:val="0"/>
+          <w:numId w:val="2"/>
+        </w:numPr>
+        <w:spacing w:after="40" w:line="250" w:lineRule="auto"/>
+      </w:pPr>
+      <w:r>
+        <w:rPr>
+          <w:color w:val="1A1A1A"/>
+        </w:rPr>
+        <w:t>Engineered an explainable ATS scoring engine</w:t>
+      </w:r>
+      <w:r>
+        <w:rPr>
+          <w:color w:val="1A1A1A"/>
+        </w:rPr>
+        <w:t xml:space="preserve"> grading fit across six weighted categories with a neutralise-and-redistribute strategy for non-applicable criteria and a reconciliation invariant, running asynchronously on Celery with live status polling and a golden-dataset benchmark harness keeping acc</w:t>
+      </w:r>
+      <w:r>
+        <w:rPr>
+          <w:color w:val="1A1A1A"/>
+        </w:rPr>
+        <w:t>uracy measurable.</w:t>
+      </w:r>
+    </w:p>
+    <w:p>
+      <w:pPr>
+        <w:spacing w:before="120" w:after="30"/>
+      </w:pPr>
+      <w:r>
+        <w:rPr>
+          <w:b/>
+          <w:bCs/>
+          <w:color w:val="10314F"/>
+        </w:rPr>
+        <w:t>MeetingMind AI — Fully-Offline Meeting Intelligence Platform</w:t>
+      </w:r>
+      <w:r>
+        <w:rPr>
+          <w:i/>
+          <w:iCs/>
+          <w:color w:val="4A4A4A"/>
+          <w:sz w:val="18"/>
+          <w:szCs w:val="18"/>
+        </w:rPr>
+        <w:t xml:space="preserve">  ·  Independent research · sole architect &amp; developer</w:t>
+      </w:r>
+    </w:p>
+    <w:p>
+      <w:pPr>
+        <w:spacing w:after="50" w:line="250" w:lineRule="auto"/>
+      </w:pPr>
+      <w:r>
+        <w:rPr>
+          <w:b/>
+          <w:bCs/>
+          <w:color w:val="1B6E8C"/>
+          <w:sz w:val="17"/>
+          <w:szCs w:val="17"/>
+        </w:rPr>
+        <w:t xml:space="preserve">Stack: </w:t>
+      </w:r>
+      <w:r>
+        <w:rPr>
+          <w:color w:val="4A4A4A"/>
+          <w:sz w:val="17"/>
+          <w:szCs w:val="17"/>
+        </w:rPr>
+        <w:t>Python · Django 5 · DRF · Celery · Redis · PostgreSQL · Faster-Whisper · Ollama (Llama 3.2) · SpeechBrain ECAPA · FF</w:t>
+      </w:r>
+      <w:r>
+        <w:rPr>
+          <w:color w:val="4A4A4A"/>
+          <w:sz w:val="17"/>
+          <w:szCs w:val="17"/>
+        </w:rPr>
+        <w:t>mpeg · vector + full-text search · Next.js 16 · React 19 · TypeScript</w:t>
+      </w:r>
+    </w:p>
+    <w:p>
+      <w:pPr>
+        <w:pStyle w:val="ListParagraph"/>
+        <w:numPr>
+          <w:ilvl w:val="0"/>
+          <w:numId w:val="2"/>
+        </w:numPr>
+        <w:spacing w:after="40" w:line="250" w:lineRule="auto"/>
+      </w:pPr>
+      <w:r>
+        <w:rPr>
+          <w:color w:val="1A1A1A"/>
+        </w:rPr>
+        <w:t>Built a meeting-assistant platform turning raw audio and video into transcripts, grounded summaries, tracked work and organisational knowledge — running entirely locally with no paid API</w:t>
+      </w:r>
+      <w:r>
+        <w:rPr>
+          <w:color w:val="1A1A1A"/>
+        </w:rPr>
+        <w:t>s, cloud AI or commercial SDKs, every AI capability behind a provider interface defaulting to a local engine.</w:t>
+      </w:r>
+    </w:p>
+    <w:p>
+      <w:pPr>
+        <w:pStyle w:val="ListParagraph"/>
+        <w:numPr>
+          <w:ilvl w:val="0"/>
+          <w:numId w:val="2"/>
+        </w:numPr>
+        <w:spacing w:after="40" w:line="250" w:lineRule="auto"/>
+      </w:pPr>
+      <w:r>
+        <w:rPr>
+          <w:color w:val="1A1A1A"/>
+        </w:rPr>
+        <w:t>Engineered an asynchronous Celery pipeline (validate → extract → normalise → transcribe → diarise → summarise → index) with graceful degradation s</w:t>
+      </w:r>
+      <w:r>
+        <w:rPr>
+          <w:color w:val="1A1A1A"/>
+        </w:rPr>
+        <w:t>o a failed AI step never discards a good transcript, plus a reusable domain-agnostic job engine with dependency-graph ordering, exponential-backoff retry, idempotent resume and live progress.</w:t>
+      </w:r>
+    </w:p>
+    <w:p>
+      <w:pPr>
+        <w:pStyle w:val="ListParagraph"/>
+        <w:numPr>
+          <w:ilvl w:val="0"/>
+          <w:numId w:val="2"/>
+        </w:numPr>
+        <w:spacing w:after="40" w:line="250" w:lineRule="auto"/>
+      </w:pPr>
+      <w:r>
+        <w:rPr>
+          <w:color w:val="1A1A1A"/>
+        </w:rPr>
+        <w:t>Implemented grounded RAG chat over hybrid retrieval (local embed</w:t>
+      </w:r>
+      <w:r>
+        <w:rPr>
+          <w:color w:val="1A1A1A"/>
+        </w:rPr>
+        <w:t>dings, Postgres full-text, recency) returning clickable-timestamp citations and refusing to answer beyond source material, and speaker diarisation via SpeechBrain ECAPA embeddings with a cross-meeting voice registry recognising recurring speakers through t</w:t>
+      </w:r>
+      <w:r>
+        <w:rPr>
+          <w:color w:val="1A1A1A"/>
+        </w:rPr>
+        <w:t>iered similarity matching.</w:t>
+      </w:r>
+    </w:p>
+    <w:p>
+      <w:pPr>
+        <w:pStyle w:val="ListParagraph"/>
+        <w:numPr>
+          <w:ilvl w:val="0"/>
+          <w:numId w:val="2"/>
+        </w:numPr>
+        <w:spacing w:after="40" w:line="250" w:lineRule="auto"/>
+      </w:pPr>
+      <w:r>
+        <w:rPr>
+          <w:color w:val="1A1A1A"/>
+        </w:rPr>
+        <w:t>Designed a bitemporal, event-sourced knowledge hub with time-travel queries, decision-evolution history and conflict detection, feeding an executive dashboard materialised incrementally rather than recomputed per request, alongsi</w:t>
+      </w:r>
+      <w:r>
+        <w:rPr>
+          <w:color w:val="1A1A1A"/>
+        </w:rPr>
+        <w:t>de a 12-agent platform accessing data only through a permissioned tool registry with human approval gates.</w:t>
       </w:r>
     </w:p>
     <w:p>
@@ -2610,99 +2728,108 @@
           <w:sz w:val="17"/>
           <w:szCs w:val="17"/>
         </w:rPr>
-        <w:t xml:space="preserve">Stack: </w:t>
-      </w:r>
-      <w:r>
-        <w:rPr>
-          <w:color w:val="4A4A4A"/>
-          <w:sz w:val="17"/>
-          <w:szCs w:val="17"/>
-        </w:rPr>
-        <w:t>Next.js 14 · TypeScript · Django REST Framework · PostgreSQL · Redis · We</w:t>
-      </w:r>
-      <w:r>
-        <w:rPr>
-          <w:color w:val="4A4A4A"/>
-          <w:sz w:val="17"/>
-          <w:szCs w:val="17"/>
-        </w:rPr>
-        <w:t>bSockets · JWT</w:t>
-      </w:r>
-    </w:p>
-    <w:p>
-      <w:pPr>
-        <w:pStyle w:val="ListParagraph"/>
-        <w:numPr>
-          <w:ilvl w:val="0"/>
-          <w:numId w:val="2"/>
-        </w:numPr>
-        <w:spacing w:after="40" w:line="250" w:lineRule="auto"/>
-      </w:pPr>
-      <w:r>
-        <w:rPr>
-          <w:color w:val="1A1A1A"/>
-        </w:rPr>
-        <w:t>Architected an enterprise hospital operating system unifying patient management, EMR, pharmacy, laboratory, nursing and ward management, billing, staff administration and analytics into a single platform.</w:t>
-      </w:r>
-    </w:p>
-    <w:p>
-      <w:pPr>
-        <w:pStyle w:val="ListParagraph"/>
-        <w:numPr>
-          <w:ilvl w:val="0"/>
-          <w:numId w:val="2"/>
-        </w:numPr>
-        <w:spacing w:after="40" w:line="250" w:lineRule="auto"/>
-      </w:pPr>
-      <w:r>
-        <w:rPr>
-          <w:color w:val="1A1A1A"/>
-        </w:rPr>
-        <w:t>Implemented granular role-based acce</w:t>
-      </w:r>
-      <w:r>
-        <w:rPr>
-          <w:color w:val="1A1A1A"/>
-        </w:rPr>
-        <w:t>ss control across eight distinct roles — doctors, nurses, pharmacists, lab technicians, accountants, receptionists and administrators — on top of JWT authentication.</w:t>
-      </w:r>
-    </w:p>
-    <w:p>
-      <w:pPr>
-        <w:pStyle w:val="ListParagraph"/>
-        <w:numPr>
-          <w:ilvl w:val="0"/>
-          <w:numId w:val="2"/>
-        </w:numPr>
-        <w:spacing w:after="40" w:line="250" w:lineRule="auto"/>
-      </w:pPr>
-      <w:r>
-        <w:rPr>
-          <w:color w:val="1A1A1A"/>
-        </w:rPr>
-        <w:t>Delivered real-time clinical workflows over WebSockets: lab result delivery, pharmacy low-</w:t>
-      </w:r>
-      <w:r>
-        <w:rPr>
-          <w:color w:val="1A1A1A"/>
-        </w:rPr>
-        <w:t>stock alerts, emergency notifications and live bed-occupancy changes.</w:t>
-      </w:r>
-    </w:p>
-    <w:p>
-      <w:pPr>
-        <w:pStyle w:val="ListParagraph"/>
-        <w:numPr>
-          <w:ilvl w:val="0"/>
-          <w:numId w:val="2"/>
-        </w:numPr>
-        <w:spacing w:after="40" w:line="250" w:lineRule="auto"/>
-      </w:pPr>
-      <w:r>
-        <w:rPr>
-          <w:color w:val="1A1A1A"/>
-        </w:rPr>
-        <w:t>Built an analytics layer surfacing operational KPIs, revenue analysis and occupancy statistics, backed by PostgreSQL with Redis caching for read-heavy dashboards.</w:t>
+        <w:t>St</w:t>
+      </w:r>
+      <w:r>
+        <w:rPr>
+          <w:b/>
+          <w:bCs/>
+          <w:color w:val="1B6E8C"/>
+          <w:sz w:val="17"/>
+          <w:szCs w:val="17"/>
+        </w:rPr>
+        <w:t xml:space="preserve">ack: </w:t>
+      </w:r>
+      <w:r>
+        <w:rPr>
+          <w:color w:val="4A4A4A"/>
+          <w:sz w:val="17"/>
+          <w:szCs w:val="17"/>
+        </w:rPr>
+        <w:t>Next.js 14 · TypeScript · Django REST Framework · PostgreSQL · Redis · WebSockets · JWT</w:t>
+      </w:r>
+    </w:p>
+    <w:p>
+      <w:pPr>
+        <w:pStyle w:val="ListParagraph"/>
+        <w:numPr>
+          <w:ilvl w:val="0"/>
+          <w:numId w:val="2"/>
+        </w:numPr>
+        <w:spacing w:after="40" w:line="250" w:lineRule="auto"/>
+      </w:pPr>
+      <w:r>
+        <w:rPr>
+          <w:color w:val="1A1A1A"/>
+        </w:rPr>
+        <w:lastRenderedPageBreak/>
+        <w:t>Architected an enterprise hospital operating system unifying patient management, EMR, pharmacy, laboratory, nursing and ward management, billing, staff administrat</w:t>
+      </w:r>
+      <w:r>
+        <w:rPr>
+          <w:color w:val="1A1A1A"/>
+        </w:rPr>
+        <w:t>ion and analytics into a single platform.</w:t>
+      </w:r>
+    </w:p>
+    <w:p>
+      <w:pPr>
+        <w:pStyle w:val="ListParagraph"/>
+        <w:numPr>
+          <w:ilvl w:val="0"/>
+          <w:numId w:val="2"/>
+        </w:numPr>
+        <w:spacing w:after="40" w:line="250" w:lineRule="auto"/>
+      </w:pPr>
+      <w:r>
+        <w:rPr>
+          <w:color w:val="1A1A1A"/>
+        </w:rPr>
+        <w:t>Implemented granular role-based access control across eight distinct roles — doctors, nurses, pharmacists, lab technicians, accountants, receptionists and administrators — on top of JWT authentication.</w:t>
+      </w:r>
+    </w:p>
+    <w:p>
+      <w:pPr>
+        <w:pStyle w:val="ListParagraph"/>
+        <w:numPr>
+          <w:ilvl w:val="0"/>
+          <w:numId w:val="2"/>
+        </w:numPr>
+        <w:spacing w:after="40" w:line="250" w:lineRule="auto"/>
+      </w:pPr>
+      <w:r>
+        <w:rPr>
+          <w:color w:val="1A1A1A"/>
+        </w:rPr>
+        <w:t>Delivered re</w:t>
+      </w:r>
+      <w:r>
+        <w:rPr>
+          <w:color w:val="1A1A1A"/>
+        </w:rPr>
+        <w:t>al-time clinical workflows over WebSockets: lab result delivery, pharmacy low-stock alerts, emergency notifications and live bed-occupancy changes.</w:t>
+      </w:r>
+    </w:p>
+    <w:p>
+      <w:pPr>
+        <w:pStyle w:val="ListParagraph"/>
+        <w:numPr>
+          <w:ilvl w:val="0"/>
+          <w:numId w:val="2"/>
+        </w:numPr>
+        <w:spacing w:after="40" w:line="250" w:lineRule="auto"/>
+      </w:pPr>
+      <w:r>
+        <w:rPr>
+          <w:color w:val="1A1A1A"/>
+        </w:rPr>
+        <w:t>Built an analytics layer surfacing operational KPIs, revenue analysis and occupancy statistics, backed by Po</w:t>
+      </w:r>
+      <w:r>
+        <w:rPr>
+          <w:color w:val="1A1A1A"/>
+        </w:rPr>
+        <w:t>stgreSQL with Redis caching for read-heavy dashboards.</w:t>
       </w:r>
     </w:p>
     <w:p>
@@ -2751,53 +2878,53 @@
           <w:sz w:val="17"/>
           <w:szCs w:val="17"/>
         </w:rPr>
-        <w:t>Flutter (Riverpod, Freezed, Dio, GoRouter) · Django REST Framework · PostgreSQL · Redis · Celery · Django Channels · Stripe · FCM · Googl</w:t>
-      </w:r>
-      <w:r>
-        <w:rPr>
-          <w:color w:val="4A4A4A"/>
-          <w:sz w:val="17"/>
-          <w:szCs w:val="17"/>
-        </w:rPr>
-        <w:t>e Maps</w:t>
-      </w:r>
-    </w:p>
-    <w:p>
-      <w:pPr>
-        <w:pStyle w:val="ListParagraph"/>
-        <w:numPr>
-          <w:ilvl w:val="0"/>
-          <w:numId w:val="2"/>
-        </w:numPr>
-        <w:spacing w:after="40" w:line="250" w:lineRule="auto"/>
-      </w:pPr>
-      <w:r>
-        <w:rPr>
-          <w:color w:val="1A1A1A"/>
-        </w:rPr>
-        <w:t>Built a full booking marketplace covering service selection, time-slot scheduling, multi-vehicle management, memberships and subscription billing, loyalty tiers and a referral programme.</w:t>
-      </w:r>
-    </w:p>
-    <w:p>
-      <w:pPr>
-        <w:pStyle w:val="ListParagraph"/>
-        <w:numPr>
-          <w:ilvl w:val="0"/>
-          <w:numId w:val="2"/>
-        </w:numPr>
-        <w:spacing w:after="40" w:line="250" w:lineRule="auto"/>
-      </w:pPr>
-      <w:r>
-        <w:rPr>
-          <w:color w:val="1A1A1A"/>
-        </w:rPr>
-        <w:t>Implemented live booking tracking via WebSockets and Google Ma</w:t>
-      </w:r>
-      <w:r>
-        <w:rPr>
-          <w:color w:val="1A1A1A"/>
-        </w:rPr>
-        <w:t>ps, with passwordless OTP authentication and automatic JWT token refresh.</w:t>
+        <w:t>Flutter (Riverpod, Freezed, Dio, GoRouter) · Django REST Fr</w:t>
+      </w:r>
+      <w:r>
+        <w:rPr>
+          <w:color w:val="4A4A4A"/>
+          <w:sz w:val="17"/>
+          <w:szCs w:val="17"/>
+        </w:rPr>
+        <w:t>amework · PostgreSQL · Redis · Celery · Django Channels · Stripe · FCM · Google Maps</w:t>
+      </w:r>
+    </w:p>
+    <w:p>
+      <w:pPr>
+        <w:pStyle w:val="ListParagraph"/>
+        <w:numPr>
+          <w:ilvl w:val="0"/>
+          <w:numId w:val="2"/>
+        </w:numPr>
+        <w:spacing w:after="40" w:line="250" w:lineRule="auto"/>
+      </w:pPr>
+      <w:r>
+        <w:rPr>
+          <w:color w:val="1A1A1A"/>
+        </w:rPr>
+        <w:t>Built a full booking marketplace covering service selection, time-slot scheduling, multi-vehicle management, memberships and subscription billing, loyalty tiers and a refe</w:t>
+      </w:r>
+      <w:r>
+        <w:rPr>
+          <w:color w:val="1A1A1A"/>
+        </w:rPr>
+        <w:t>rral programme.</w:t>
+      </w:r>
+    </w:p>
+    <w:p>
+      <w:pPr>
+        <w:pStyle w:val="ListParagraph"/>
+        <w:numPr>
+          <w:ilvl w:val="0"/>
+          <w:numId w:val="2"/>
+        </w:numPr>
+        <w:spacing w:after="40" w:line="250" w:lineRule="auto"/>
+      </w:pPr>
+      <w:r>
+        <w:rPr>
+          <w:color w:val="1A1A1A"/>
+        </w:rPr>
+        <w:t>Implemented live booking tracking via WebSockets and Google Maps, with passwordless OTP authentication and automatic JWT token refresh.</w:t>
       </w:r>
     </w:p>
     <w:p>
@@ -2829,13 +2956,13 @@
         <w:rPr>
           <w:color w:val="1A1A1A"/>
         </w:rPr>
-        <w:t>Delivered an ope</w:t>
-      </w:r>
-      <w:r>
-        <w:rPr>
-          <w:color w:val="1A1A1A"/>
-        </w:rPr>
-        <w:t>rations dashboard for booking, staff, attendance and schedule management, plus revenue and service-utilisation reporting.</w:t>
+        <w:t xml:space="preserve">Delivered an operations dashboard for booking, staff, attendance and schedule management, </w:t>
+      </w:r>
+      <w:r>
+        <w:rPr>
+          <w:color w:val="1A1A1A"/>
+        </w:rPr>
+        <w:t>plus revenue and service-utilisation reporting.</w:t>
       </w:r>
     </w:p>
     <w:p>
@@ -2850,7 +2977,174 @@
             <w:color w:val="10314F"/>
             <w:u w:val="single"/>
           </w:rPr>
-          <w:t>ShieldDNS v2.0 — Cross-Platform Ad, Tracker &amp; Malware Blocking Ecosyste</w:t>
+          <w:t>ShieldDNS v2.0 — Cross-Platform Ad, Tracker &amp; Malware Blocking Ecosystem</w:t>
+        </w:r>
+      </w:hyperlink>
+      <w:r>
+        <w:rPr>
+          <w:i/>
+          <w:iCs/>
+          <w:color w:val="4A4A4A"/>
+          <w:sz w:val="18"/>
+          <w:szCs w:val="18"/>
+        </w:rPr>
+        <w:t xml:space="preserve">  ·  Three apps, sole developer · MIT open source</w:t>
+      </w:r>
+    </w:p>
+    <w:p>
+      <w:pPr>
+        <w:spacing w:after="50" w:line="250" w:lineRule="auto"/>
+      </w:pPr>
+      <w:r>
+        <w:rPr>
+          <w:b/>
+          <w:bCs/>
+          <w:color w:val="1B6E8C"/>
+          <w:sz w:val="17"/>
+          <w:szCs w:val="17"/>
+        </w:rPr>
+        <w:t xml:space="preserve">Stack: </w:t>
+      </w:r>
+      <w:r>
+        <w:rPr>
+          <w:color w:val="4A4A4A"/>
+          <w:sz w:val="17"/>
+          <w:szCs w:val="17"/>
+        </w:rPr>
+        <w:t xml:space="preserve">Android: Kotlin </w:t>
+      </w:r>
+      <w:r>
+        <w:rPr>
+          <w:color w:val="4A4A4A"/>
+          <w:sz w:val="17"/>
+          <w:szCs w:val="17"/>
+        </w:rPr>
+        <w:t>2.0, Jetpack Compose, Hilt, Room, WorkManager, VpnService · Windows: C# / .NET 10, WPF · Extension: JavaScript, Manifest V3</w:t>
+      </w:r>
+    </w:p>
+    <w:p>
+      <w:pPr>
+        <w:pStyle w:val="ListParagraph"/>
+        <w:numPr>
+          <w:ilvl w:val="0"/>
+          <w:numId w:val="2"/>
+        </w:numPr>
+        <w:spacing w:after="40" w:line="250" w:lineRule="auto"/>
+      </w:pPr>
+      <w:r>
+        <w:rPr>
+          <w:color w:val="1A1A1A"/>
+        </w:rPr>
+        <w:t>Designed and shipped a three-platform blocking ecosystem — an Android VPN-based DNS filter, a Windows local DNS server and a Manifes</w:t>
+      </w:r>
+      <w:r>
+        <w:rPr>
+          <w:color w:val="1A1A1A"/>
+        </w:rPr>
+        <w:t>t V3 browser extension — filtering ads, trackers, malware and redirect scams entirely on-device with no accounts, telemetry or third-party routing.</w:t>
+      </w:r>
+    </w:p>
+    <w:p>
+      <w:pPr>
+        <w:pStyle w:val="ListParagraph"/>
+        <w:numPr>
+          <w:ilvl w:val="0"/>
+          <w:numId w:val="2"/>
+        </w:numPr>
+        <w:spacing w:after="40" w:line="250" w:lineRule="auto"/>
+      </w:pPr>
+      <w:r>
+        <w:rPr>
+          <w:color w:val="1A1A1A"/>
+        </w:rPr>
+        <w:t>Engineered a five-layer, fastest-first matching pipeline (session whitelist, LFU hot cache, session blacklis</w:t>
+      </w:r>
+      <w:r>
+        <w:rPr>
+          <w:color w:val="1A1A1A"/>
+        </w:rPr>
+        <w:t>t, Bloom-filter prefilter, Patricia trie) achieving microsecond lookups against millions of blocklist entries.</w:t>
+      </w:r>
+    </w:p>
+    <w:p>
+      <w:pPr>
+        <w:pStyle w:val="ListParagraph"/>
+        <w:numPr>
+          <w:ilvl w:val="0"/>
+          <w:numId w:val="2"/>
+        </w:numPr>
+        <w:spacing w:after="40" w:line="250" w:lineRule="auto"/>
+      </w:pPr>
+      <w:r>
+        <w:rPr>
+          <w:color w:val="1A1A1A"/>
+        </w:rPr>
+        <w:t>Built behavioural detection beyond static lists: CNAME uncloaking across every chain hop, a live 0–100 domain reputation score from subdomain ent</w:t>
+      </w:r>
+      <w:r>
+        <w:rPr>
+          <w:color w:val="1A1A1A"/>
+        </w:rPr>
+        <w:t>ropy, risky TLDs, homoglyph detection and visit frequency with time-based decay, and multi-hop redirect-chain reconstruction scored by hop count, /24 IP diversity and inter-hop timing.</w:t>
+      </w:r>
+    </w:p>
+    <w:p>
+      <w:pPr>
+        <w:pStyle w:val="ListParagraph"/>
+        <w:numPr>
+          <w:ilvl w:val="0"/>
+          <w:numId w:val="2"/>
+        </w:numPr>
+        <w:spacing w:after="40" w:line="250" w:lineRule="auto"/>
+      </w:pPr>
+      <w:r>
+        <w:rPr>
+          <w:color w:val="1A1A1A"/>
+        </w:rPr>
+        <w:t>Implemented encrypted DoH/DoT upstream resolution with compiled bootstr</w:t>
+      </w:r>
+      <w:r>
+        <w:rPr>
+          <w:color w:val="1A1A1A"/>
+        </w:rPr>
+        <w:t>ap IPs to avoid pre-tunnel resolution deadlock, a DNS-layer per-app firewall across Wi-Fi, mobile data and roaming, and three tiered shield presets trading false-positive rate against aggressiveness.</w:t>
+      </w:r>
+    </w:p>
+    <w:p>
+      <w:pPr>
+        <w:pStyle w:val="ListParagraph"/>
+        <w:numPr>
+          <w:ilvl w:val="0"/>
+          <w:numId w:val="2"/>
+        </w:numPr>
+        <w:spacing w:after="40" w:line="250" w:lineRule="auto"/>
+      </w:pPr>
+      <w:r>
+        <w:rPr>
+          <w:color w:val="1A1A1A"/>
+        </w:rPr>
+        <w:t>Owned full release engineering — R8 shrinking, certifica</w:t>
+      </w:r>
+      <w:r>
+        <w:rPr>
+          <w:color w:val="1A1A1A"/>
+        </w:rPr>
+        <w:t>te pinning, split debug/release signing, Windows installer packaging, and automated blocklist refresh via WorkManager with boot persistence.</w:t>
+      </w:r>
+    </w:p>
+    <w:p>
+      <w:pPr>
+        <w:spacing w:before="120" w:after="30"/>
+      </w:pPr>
+      <w:hyperlink r:id="rId17" w:history="1">
+        <w:r>
+          <w:rPr>
+            <w:b/>
+            <w:bCs/>
+            <w:color w:val="10314F"/>
+            <w:u w:val="single"/>
+          </w:rPr>
+          <w:t>Student–Teacher Mana</w:t>
         </w:r>
         <w:r>
           <w:rPr>
@@ -2859,7 +3153,7 @@
             <w:color w:val="10314F"/>
             <w:u w:val="single"/>
           </w:rPr>
-          <w:t>m</w:t>
+          <w:t>gement Application</w:t>
         </w:r>
       </w:hyperlink>
       <w:r>
@@ -2870,7 +3164,7 @@
           <w:sz w:val="18"/>
           <w:szCs w:val="18"/>
         </w:rPr>
-        <w:t xml:space="preserve">  ·  Three apps, sole developer · MIT open source</w:t>
+        <w:t xml:space="preserve">  ·  Cross-platform mobile solution</w:t>
       </w:r>
     </w:p>
     <w:p>
@@ -2893,159 +3187,6 @@
           <w:sz w:val="17"/>
           <w:szCs w:val="17"/>
         </w:rPr>
-        <w:t>Android: Kotlin 2.0, Jetpack Compose, Hilt, Room, WorkManager, VpnService · Windows: C# / .NET 10, WPF · Extension: JavaScript, Manifest V3</w:t>
-      </w:r>
-    </w:p>
-    <w:p>
-      <w:pPr>
-        <w:pStyle w:val="ListParagraph"/>
-        <w:numPr>
-          <w:ilvl w:val="0"/>
-          <w:numId w:val="2"/>
-        </w:numPr>
-        <w:spacing w:after="40" w:line="250" w:lineRule="auto"/>
-      </w:pPr>
-      <w:r>
-        <w:rPr>
-          <w:color w:val="1A1A1A"/>
-        </w:rPr>
-        <w:t>Designed and shipped a three-platform blocking ecosystem — an Android VPN-based DNS filter, a Windows local DNS serv</w:t>
-      </w:r>
-      <w:r>
-        <w:rPr>
-          <w:color w:val="1A1A1A"/>
-        </w:rPr>
-        <w:t>er and a Manifest V3 browser extension — filtering ads, trackers, malware and redirect scams entirely on-device with no accounts, telemetry or third-party routing.</w:t>
-      </w:r>
-    </w:p>
-    <w:p>
-      <w:pPr>
-        <w:pStyle w:val="ListParagraph"/>
-        <w:numPr>
-          <w:ilvl w:val="0"/>
-          <w:numId w:val="2"/>
-        </w:numPr>
-        <w:spacing w:after="40" w:line="250" w:lineRule="auto"/>
-      </w:pPr>
-      <w:r>
-        <w:rPr>
-          <w:color w:val="1A1A1A"/>
-        </w:rPr>
-        <w:t>Engineered a five-layer, fastest-first matching pipeline (session whitelist, LFU hot cache, session blacklist, Bloom-filter prefilter, Patricia trie) achieving microsecond lookups against millions of blocklist entries.</w:t>
-      </w:r>
-    </w:p>
-    <w:p>
-      <w:pPr>
-        <w:pStyle w:val="ListParagraph"/>
-        <w:numPr>
-          <w:ilvl w:val="0"/>
-          <w:numId w:val="2"/>
-        </w:numPr>
-        <w:spacing w:after="40" w:line="250" w:lineRule="auto"/>
-      </w:pPr>
-      <w:r>
-        <w:rPr>
-          <w:color w:val="1A1A1A"/>
-        </w:rPr>
-        <w:t>Built behavioural detection beyond st</w:t>
-      </w:r>
-      <w:r>
-        <w:rPr>
-          <w:color w:val="1A1A1A"/>
-        </w:rPr>
-        <w:t>atic lists: CNAME uncloaking across every chain hop, a live 0–100 domain reputation score from subdomain entropy, risky TLDs, homoglyph detection and visit frequency with time-based decay, and multi-hop redirect-chain reconstruction scored by hop count, /2</w:t>
-      </w:r>
-      <w:r>
-        <w:rPr>
-          <w:color w:val="1A1A1A"/>
-        </w:rPr>
-        <w:t>4 IP diversity and inter-hop timing.</w:t>
-      </w:r>
-    </w:p>
-    <w:p>
-      <w:pPr>
-        <w:pStyle w:val="ListParagraph"/>
-        <w:numPr>
-          <w:ilvl w:val="0"/>
-          <w:numId w:val="2"/>
-        </w:numPr>
-        <w:spacing w:after="40" w:line="250" w:lineRule="auto"/>
-      </w:pPr>
-      <w:r>
-        <w:rPr>
-          <w:color w:val="1A1A1A"/>
-        </w:rPr>
-        <w:t xml:space="preserve">Implemented encrypted DoH/DoT upstream resolution with compiled bootstrap IPs to avoid pre-tunnel resolution deadlock, a DNS-layer per-app firewall across Wi-Fi, mobile data and roaming, and three tiered shield presets </w:t>
-      </w:r>
-      <w:r>
-        <w:rPr>
-          <w:color w:val="1A1A1A"/>
-        </w:rPr>
-        <w:t>trading false-positive rate against aggressiveness.</w:t>
-      </w:r>
-    </w:p>
-    <w:p>
-      <w:pPr>
-        <w:pStyle w:val="ListParagraph"/>
-        <w:numPr>
-          <w:ilvl w:val="0"/>
-          <w:numId w:val="2"/>
-        </w:numPr>
-        <w:spacing w:after="40" w:line="250" w:lineRule="auto"/>
-      </w:pPr>
-      <w:r>
-        <w:rPr>
-          <w:color w:val="1A1A1A"/>
-        </w:rPr>
-        <w:t>Owned full release engineering — R8 shrinking, certificate pinning, split debug/release signing, Windows installer packaging, and automated blocklist refresh via WorkManager with boot persistence.</w:t>
-      </w:r>
-    </w:p>
-    <w:p>
-      <w:pPr>
-        <w:spacing w:before="120" w:after="30"/>
-      </w:pPr>
-      <w:hyperlink r:id="rId17" w:history="1">
-        <w:r>
-          <w:rPr>
-            <w:b/>
-            <w:bCs/>
-            <w:color w:val="10314F"/>
-            <w:u w:val="single"/>
-          </w:rPr>
-          <w:t>Student–Teacher Management Application</w:t>
-        </w:r>
-      </w:hyperlink>
-      <w:r>
-        <w:rPr>
-          <w:i/>
-          <w:iCs/>
-          <w:color w:val="4A4A4A"/>
-          <w:sz w:val="18"/>
-          <w:szCs w:val="18"/>
-        </w:rPr>
-        <w:t xml:space="preserve">  ·  Cross-platform mobile solution</w:t>
-      </w:r>
-    </w:p>
-    <w:p>
-      <w:pPr>
-        <w:spacing w:after="50" w:line="250" w:lineRule="auto"/>
-      </w:pPr>
-      <w:r>
-        <w:rPr>
-          <w:b/>
-          <w:bCs/>
-          <w:color w:val="1B6E8C"/>
-          <w:sz w:val="17"/>
-          <w:szCs w:val="17"/>
-        </w:rPr>
-        <w:t xml:space="preserve">Stack: </w:t>
-      </w:r>
-      <w:r>
-        <w:rPr>
-          <w:color w:val="4A4A4A"/>
-          <w:sz w:val="17"/>
-          <w:szCs w:val="17"/>
-        </w:rPr>
         <w:t>React Native · Django REST Framework · MySQL</w:t>
       </w:r>
     </w:p>
@@ -3062,13 +3203,13 @@
         <w:rPr>
           <w:color w:val="1A1A1A"/>
         </w:rPr>
-        <w:t>Delivered role-separated dashboards for te</w:t>
-      </w:r>
-      <w:r>
-        <w:rPr>
-          <w:color w:val="1A1A1A"/>
-        </w:rPr>
-        <w:t>achers and students covering attendance capture, marks entry, class and subject management and in-app notifications, replacing manual record-keeping.</w:t>
+        <w:t>Delivered role-separated dashboards for teachers and students covering attendance capture, marks entry, class and subject management and in-app notifi</w:t>
+      </w:r>
+      <w:r>
+        <w:rPr>
+          <w:color w:val="1A1A1A"/>
+        </w:rPr>
+        <w:t>cations, replacing manual record-keeping.</w:t>
       </w:r>
     </w:p>
     <w:p>
@@ -3094,17 +3235,7 @@
           <w:sz w:val="18"/>
           <w:szCs w:val="18"/>
         </w:rPr>
-        <w:t xml:space="preserve">  · </w:t>
-      </w:r>
-      <w:r>
-        <w:rPr>
-          <w:i/>
-          <w:iCs/>
-          <w:color w:val="4A4A4A"/>
-          <w:sz w:val="18"/>
-          <w:szCs w:val="18"/>
-        </w:rPr>
-        <w:t xml:space="preserve"> Full-stack web application</w:t>
+        <w:t xml:space="preserve">  ·  Full-stack web application</w:t>
       </w:r>
     </w:p>
     <w:p>
@@ -3143,13 +3274,13 @@
         <w:rPr>
           <w:color w:val="1A1A1A"/>
         </w:rPr>
-        <w:t>Built stock, seller and sales management with auto-updating inventory levels, configurable low-stock alerts and an analytics dashboard reporting revenue trends, top sellers and stock availa</w:t>
-      </w:r>
-      <w:r>
-        <w:rPr>
-          <w:color w:val="1A1A1A"/>
-        </w:rPr>
-        <w:t>bility.</w:t>
+        <w:t xml:space="preserve">Built stock, seller and sales management </w:t>
+      </w:r>
+      <w:r>
+        <w:rPr>
+          <w:color w:val="1A1A1A"/>
+        </w:rPr>
+        <w:t>with auto-updating inventory levels, configurable low-stock alerts and an analytics dashboard reporting revenue trends, top sellers and stock availability.</w:t>
       </w:r>
     </w:p>
     <w:p>
@@ -3164,7 +3295,16 @@
             <w:color w:val="10314F"/>
             <w:u w:val="single"/>
           </w:rPr>
-          <w:t>People Safety &amp; Crime Reporting System</w:t>
+          <w:t>People Safety &amp; Crime Reporting Sy</w:t>
+        </w:r>
+        <w:r>
+          <w:rPr>
+            <w:b/>
+            <w:bCs/>
+            <w:color w:val="10314F"/>
+            <w:u w:val="single"/>
+          </w:rPr>
+          <w:t>stem</w:t>
         </w:r>
       </w:hyperlink>
       <w:r>
@@ -3214,13 +3354,13 @@
         <w:rPr>
           <w:color w:val="1A1A1A"/>
         </w:rPr>
-        <w:t xml:space="preserve">Developed map-based crime reporting with proximity alerts, </w:t>
-      </w:r>
-      <w:r>
-        <w:rPr>
-          <w:color w:val="1A1A1A"/>
-        </w:rPr>
-        <w:t>real-time chat between users and authorities, an SOS contact broadcast and admin-defined risk-graded danger zones.</w:t>
+        <w:t xml:space="preserve">Developed map-based crime reporting with proximity alerts, real-time chat between users and authorities, an SOS contact broadcast and admin-defined risk-graded danger </w:t>
+      </w:r>
+      <w:r>
+        <w:rPr>
+          <w:color w:val="1A1A1A"/>
+        </w:rPr>
+        <w:t>zones.</w:t>
       </w:r>
     </w:p>
     <w:p>
@@ -3261,17 +3401,7 @@
           <w:sz w:val="17"/>
           <w:szCs w:val="17"/>
         </w:rPr>
-        <w:t>Stac</w:t>
-      </w:r>
-      <w:r>
-        <w:rPr>
-          <w:b/>
-          <w:bCs/>
-          <w:color w:val="1B6E8C"/>
-          <w:sz w:val="17"/>
-          <w:szCs w:val="17"/>
-        </w:rPr>
-        <w:t xml:space="preserve">k: </w:t>
+        <w:t xml:space="preserve">Stack: </w:t>
       </w:r>
       <w:r>
         <w:rPr>
@@ -3333,7 +3463,13 @@
         <w:rPr>
           <w:color w:val="1A1A1A"/>
         </w:rPr>
-        <w:t xml:space="preserve">  —  Anna University, India  |  2022  |  CGPA 7.61 / 10</w:t>
+        <w:t xml:space="preserve">  —  An</w:t>
+      </w:r>
+      <w:r>
+        <w:rPr>
+          <w:color w:val="1A1A1A"/>
+        </w:rPr>
+        <w:t>na University, India  |  2022  |  CGPA 7.61 / 10</w:t>
       </w:r>
     </w:p>
     <w:p>
@@ -3365,13 +3501,7 @@
         <w:rPr>
           <w:color w:val="1A1A1A"/>
         </w:rPr>
-        <w:t>Codeathon Event Project — IBM Certification, SLA Institute, Ch</w:t>
-      </w:r>
-      <w:r>
-        <w:rPr>
-          <w:color w:val="1A1A1A"/>
-        </w:rPr>
-        <w:t>ennai</w:t>
+        <w:t>Codeathon Event Project — IBM Certification, SLA Institute, Chennai</w:t>
       </w:r>
     </w:p>
     <w:p>
@@ -3390,6 +3520,7 @@
           <w:sz w:val="20"/>
           <w:szCs w:val="20"/>
         </w:rPr>
+        <w:lastRenderedPageBreak/>
         <w:t>ADDITIONAL INFORMATION</w:t>
       </w:r>
     </w:p>
@@ -3472,7 +3603,13 @@
         <w:rPr>
           <w:color w:val="1A1A1A"/>
         </w:rPr>
-        <w:t>English (professional working proficiency — primary language of all client delivery), Tamil (native).</w:t>
+        <w:t>English (professional working proficiency — primary language of all clie</w:t>
+      </w:r>
+      <w:r>
+        <w:rPr>
+          <w:color w:val="1A1A1A"/>
+        </w:rPr>
+        <w:t>nt delivery), Tamil (native).</w:t>
       </w:r>
     </w:p>
     <w:p>
@@ -3491,13 +3628,7 @@
         <w:rPr>
           <w:color w:val="1A1A1A"/>
         </w:rPr>
-        <w:t>Sole-owner product delivery, direct stakeholder communication, rapid onboarding to unfamiliar stacks, debugging and performance optimisation, s</w:t>
-      </w:r>
-      <w:r>
-        <w:rPr>
-          <w:color w:val="1A1A1A"/>
-        </w:rPr>
-        <w:t>ecurity-first implementation.</w:t>
+        <w:t>Sole-owner product delivery, direct stakeholder communication, rapid onboarding to unfamiliar stacks, debugging and performance optimisation, security-first implementation.</w:t>
       </w:r>
     </w:p>
     <w:p>
@@ -3518,6 +3649,7 @@
         </w:rPr>
         <w:t>Available on request.</w:t>
       </w:r>
+      <w:bookmarkEnd w:id="0"/>
     </w:p>
     <w:sectPr>
       <w:pgSz w:w="11906" w:h="16838"/>
@@ -3532,10 +3664,10 @@
 <file path=word/numbering.xml><?xml version="1.0" encoding="utf-8"?>
 <w:numbering xmlns:wpc="http://schemas.microsoft.com/office/word/2010/wordprocessingCanvas" xmlns:cx="http://schemas.microsoft.com/office/drawing/2014/chartex" xmlns:cx1="http://schemas.microsoft.com/office/drawing/2015/9/8/chartex" xmlns:cx2="http://schemas.microsoft.com/office/drawing/2015/10/21/chartex" xmlns:cx3="http://schemas.microsoft.com/office/drawing/2016/5/9/chartex" xmlns:cx4="http://schemas.microsoft.com/office/drawing/2016/5/10/chartex" xmlns:cx5="http://schemas.microsoft.com/office/drawing/2016/5/11/chartex" xmlns:cx6="http://schemas.microsoft.com/office/drawing/2016/5/12/chartex" xmlns:cx7="http://schemas.microsoft.com/office/drawing/2016/5/13/chartex" xmlns:cx8="http://schemas.microsoft.com/office/drawing/2016/5/14/chartex" xmlns:mc="http://schemas.openxmlformats.org/markup-compatibility/2006" xmlns:aink="http://schemas.microsoft.com/office/drawing/2016/ink" xmlns:am3d="http://schemas.microsoft.com/office/drawing/2017/model3d" xmlns:o="urn:schemas-microsoft-com:office:office" xmlns:r="http://schemas.openxmlformats.org/officeDocument/2006/relationships" xmlns:m="http://schemas.openxmlformats.org/officeDocument/2006/math" xmlns:v="urn:schemas-microsoft-com:vml" xmlns:wp14="http://schemas.microsoft.com/office/word/2010/wordprocessingDrawing" xmlns:wp="http://schemas.openxmlformats.org/drawingml/2006/wordprocessingDrawing" xmlns:w10="urn:schemas-microsoft-com:office:word" xmlns:w="http://schemas.openxmlformats.org/wordprocessingml/2006/main" xmlns:w14="http://schemas.microsoft.com/office/word/2010/wordml" xmlns:w15="http://schemas.microsoft.com/office/word/2012/wordml" xmlns:w16cex="http://schemas.microsoft.com/office/word/2018/wordml/cex" xmlns:w16cid="http://schemas.microsoft.com/office/word/2016/wordml/cid" xmlns:w16="http://schemas.microsoft.com/office/word/2018/wordml" xmlns:w16se="http://schemas.microsoft.com/office/word/2015/wordml/symex" xmlns:wpg="http://schemas.microsoft.com/office/word/2010/wordprocessingGroup" xmlns:wpi="http://schemas.microsoft.com/office/word/2010/wordprocessingInk" xmlns:wne="http://schemas.microsoft.com/office/word/2006/wordml" xmlns:wps="http://schemas.microsoft.com/office/word/2010/wordprocessingShape" mc:Ignorable="w14 w15 w16se w16cid w16 w16cex wp14">
   <w:abstractNum w:abstractNumId="0" w15:restartNumberingAfterBreak="0">
-    <w:nsid w:val="0E580002"/>
+    <w:nsid w:val="472C2B74"/>
     <w:multiLevelType w:val="hybridMultilevel"/>
-    <w:tmpl w:val="DB3AC524"/>
-    <w:lvl w:ilvl="0" w:tplc="6B6C74F2">
+    <w:tmpl w:val="6EF41BB0"/>
+    <w:lvl w:ilvl="0" w:tplc="B3A44964">
       <w:start w:val="1"/>
       <w:numFmt w:val="bullet"/>
       <w:lvlText w:val="●"/>
@@ -3544,7 +3676,7 @@
         <w:ind w:left="720" w:hanging="360"/>
       </w:pPr>
     </w:lvl>
-    <w:lvl w:ilvl="1" w:tplc="DE3E6BAE">
+    <w:lvl w:ilvl="1" w:tplc="06B6F510">
       <w:start w:val="1"/>
       <w:numFmt w:val="bullet"/>
       <w:lvlText w:val="○"/>
@@ -3553,7 +3685,7 @@
         <w:ind w:left="1440" w:hanging="360"/>
       </w:pPr>
     </w:lvl>
-    <w:lvl w:ilvl="2" w:tplc="5A5281BC">
+    <w:lvl w:ilvl="2" w:tplc="1BC6FBBE">
       <w:start w:val="1"/>
       <w:numFmt w:val="bullet"/>
       <w:lvlText w:val="■"/>
@@ -3562,7 +3694,7 @@
         <w:ind w:left="2160" w:hanging="360"/>
       </w:pPr>
     </w:lvl>
-    <w:lvl w:ilvl="3" w:tplc="9D0A0852">
+    <w:lvl w:ilvl="3" w:tplc="3224142C">
       <w:start w:val="1"/>
       <w:numFmt w:val="bullet"/>
       <w:lvlText w:val="●"/>
@@ -3571,7 +3703,7 @@
         <w:ind w:left="2880" w:hanging="360"/>
       </w:pPr>
     </w:lvl>
-    <w:lvl w:ilvl="4" w:tplc="88B278CA">
+    <w:lvl w:ilvl="4" w:tplc="1A5C8F4A">
       <w:start w:val="1"/>
       <w:numFmt w:val="bullet"/>
       <w:lvlText w:val="○"/>
@@ -3580,7 +3712,7 @@
         <w:ind w:left="3600" w:hanging="360"/>
       </w:pPr>
     </w:lvl>
-    <w:lvl w:ilvl="5" w:tplc="69A65EC8">
+    <w:lvl w:ilvl="5" w:tplc="9F0CF9CA">
       <w:start w:val="1"/>
       <w:numFmt w:val="bullet"/>
       <w:lvlText w:val="■"/>
@@ -3589,7 +3721,7 @@
         <w:ind w:left="4320" w:hanging="360"/>
       </w:pPr>
     </w:lvl>
-    <w:lvl w:ilvl="6" w:tplc="8014EB90">
+    <w:lvl w:ilvl="6" w:tplc="5BDC61E6">
       <w:start w:val="1"/>
       <w:numFmt w:val="bullet"/>
       <w:lvlText w:val="●"/>
@@ -3598,7 +3730,7 @@
         <w:ind w:left="5040" w:hanging="360"/>
       </w:pPr>
     </w:lvl>
-    <w:lvl w:ilvl="7" w:tplc="8946E03C">
+    <w:lvl w:ilvl="7" w:tplc="50A0963A">
       <w:start w:val="1"/>
       <w:numFmt w:val="bullet"/>
       <w:lvlText w:val="●"/>
@@ -3607,7 +3739,7 @@
         <w:ind w:left="5760" w:hanging="360"/>
       </w:pPr>
     </w:lvl>
-    <w:lvl w:ilvl="8" w:tplc="0C2A1A64">
+    <w:lvl w:ilvl="8" w:tplc="BA8051A6">
       <w:start w:val="1"/>
       <w:numFmt w:val="bullet"/>
       <w:lvlText w:val="●"/>
@@ -3618,10 +3750,10 @@
     </w:lvl>
   </w:abstractNum>
   <w:abstractNum w:abstractNumId="1" w15:restartNumberingAfterBreak="0">
-    <w:nsid w:val="6AE06908"/>
+    <w:nsid w:val="6C9E2839"/>
     <w:multiLevelType w:val="hybridMultilevel"/>
-    <w:tmpl w:val="2A66D1A2"/>
-    <w:lvl w:ilvl="0" w:tplc="B050856E">
+    <w:tmpl w:val="9C3E8BE6"/>
+    <w:lvl w:ilvl="0" w:tplc="6DBE6F50">
       <w:start w:val="1"/>
       <w:numFmt w:val="bullet"/>
       <w:lvlText w:val="•"/>
@@ -3630,7 +3762,7 @@
         <w:ind w:left="316" w:hanging="215"/>
       </w:pPr>
     </w:lvl>
-    <w:lvl w:ilvl="1" w:tplc="3034C976">
+    <w:lvl w:ilvl="1" w:tplc="A9C8D482">
       <w:start w:val="1"/>
       <w:numFmt w:val="bullet"/>
       <w:lvlText w:val="–"/>
@@ -3639,37 +3771,37 @@
         <w:ind w:left="648" w:hanging="215"/>
       </w:pPr>
     </w:lvl>
-    <w:lvl w:ilvl="2" w:tplc="3C305764">
+    <w:lvl w:ilvl="2" w:tplc="093A301C">
       <w:numFmt w:val="decimal"/>
       <w:lvlText w:val=""/>
       <w:lvlJc w:val="left"/>
     </w:lvl>
-    <w:lvl w:ilvl="3" w:tplc="EE889F50">
+    <w:lvl w:ilvl="3" w:tplc="03460D30">
       <w:numFmt w:val="decimal"/>
       <w:lvlText w:val=""/>
       <w:lvlJc w:val="left"/>
     </w:lvl>
-    <w:lvl w:ilvl="4" w:tplc="4600EC4E">
+    <w:lvl w:ilvl="4" w:tplc="45C27CC0">
       <w:numFmt w:val="decimal"/>
       <w:lvlText w:val=""/>
       <w:lvlJc w:val="left"/>
     </w:lvl>
-    <w:lvl w:ilvl="5" w:tplc="18C46E14">
+    <w:lvl w:ilvl="5" w:tplc="65D05206">
       <w:numFmt w:val="decimal"/>
       <w:lvlText w:val=""/>
       <w:lvlJc w:val="left"/>
     </w:lvl>
-    <w:lvl w:ilvl="6" w:tplc="877C0EF0">
+    <w:lvl w:ilvl="6" w:tplc="42AE96B8">
       <w:numFmt w:val="decimal"/>
       <w:lvlText w:val=""/>
       <w:lvlJc w:val="left"/>
     </w:lvl>
-    <w:lvl w:ilvl="7" w:tplc="699C07C8">
+    <w:lvl w:ilvl="7" w:tplc="8B363DF6">
       <w:numFmt w:val="decimal"/>
       <w:lvlText w:val=""/>
       <w:lvlJc w:val="left"/>
     </w:lvl>
-    <w:lvl w:ilvl="8" w:tplc="081461D6">
+    <w:lvl w:ilvl="8" w:tplc="6810C05A">
       <w:numFmt w:val="decimal"/>
       <w:lvlText w:val=""/>
       <w:lvlJc w:val="left"/>

</xml_diff>